<commit_message>
Atualização para v2 do projeto
</commit_message>
<xml_diff>
--- a/Docs/Data_Report/Data_Summary_Report.docx
+++ b/Docs/Data_Report/Data_Summary_Report.docx
@@ -7,8 +7,6 @@
         <w:spacing w:after="60"/>
         <w:rPr>
           <w:rFonts w:ascii="Arial" w:hAnsi="Arial" w:cs="Arial"/>
-          <w:sz w:val="18"/>
-          <w:szCs w:val="18"/>
         </w:rPr>
       </w:pPr>
       <w:r>
@@ -17,8 +15,8 @@
           <w:b/>
           <w:bCs/>
           <w:color w:val="1F6F50"/>
-          <w:sz w:val="36"/>
-          <w:szCs w:val="36"/>
+          <w:sz w:val="40"/>
+          <w:szCs w:val="40"/>
         </w:rPr>
         <w:t>DATA SUMMARY REPORT</w:t>
       </w:r>
@@ -54,39 +52,7 @@
           <w:rFonts w:ascii="Arial" w:hAnsi="Arial" w:cs="Arial"/>
           <w:color w:val="777777"/>
         </w:rPr>
-        <w:t xml:space="preserve">Versão: Rascunho 1 (Fase: Data Acquisition </w:t>
-      </w:r>
-      <w:proofErr w:type="spellStart"/>
-      <w:r>
-        <w:rPr>
-          <w:rFonts w:ascii="Arial" w:hAnsi="Arial" w:cs="Arial"/>
-          <w:color w:val="777777"/>
-        </w:rPr>
-        <w:t>and</w:t>
-      </w:r>
-      <w:proofErr w:type="spellEnd"/>
-      <w:r>
-        <w:rPr>
-          <w:rFonts w:ascii="Arial" w:hAnsi="Arial" w:cs="Arial"/>
-          <w:color w:val="777777"/>
-        </w:rPr>
-        <w:t xml:space="preserve"> </w:t>
-      </w:r>
-      <w:proofErr w:type="spellStart"/>
-      <w:r>
-        <w:rPr>
-          <w:rFonts w:ascii="Arial" w:hAnsi="Arial" w:cs="Arial"/>
-          <w:color w:val="777777"/>
-        </w:rPr>
-        <w:t>Understanding</w:t>
-      </w:r>
-      <w:proofErr w:type="spellEnd"/>
-      <w:r>
-        <w:rPr>
-          <w:rFonts w:ascii="Arial" w:hAnsi="Arial" w:cs="Arial"/>
-          <w:color w:val="777777"/>
-        </w:rPr>
-        <w:t xml:space="preserve"> — TDSP)</w:t>
+        <w:t>Versão 2 — Fase: Data Acquisition and Understanding — TDSP</w:t>
       </w:r>
     </w:p>
     <w:p>
@@ -115,21 +81,19 @@
         <w:rPr>
           <w:rFonts w:ascii="Arial" w:hAnsi="Arial" w:cs="Arial"/>
         </w:rPr>
-        <w:t xml:space="preserve">Este relatório apresenta o primeiro levantamento das fontes de dados que serão utilizadas no projeto, indicando o tipo de dado, o formato de acesso e o objetivo de uso de cada fonte dentro do pipeline analítico. Trata-se de um documento vivo, a ser atualizado conforme novas fontes forem avaliadas ou descartadas ao longo da fase de Data </w:t>
-      </w:r>
-      <w:proofErr w:type="spellStart"/>
-      <w:r>
-        <w:rPr>
-          <w:rFonts w:ascii="Arial" w:hAnsi="Arial" w:cs="Arial"/>
-        </w:rPr>
-        <w:t>Understanding</w:t>
-      </w:r>
-      <w:proofErr w:type="spellEnd"/>
-      <w:r>
-        <w:rPr>
-          <w:rFonts w:ascii="Arial" w:hAnsi="Arial" w:cs="Arial"/>
-        </w:rPr>
-        <w:t>.</w:t>
+        <w:t xml:space="preserve">Este relatório apresenta as fontes de dados utilizadas no projeto, indicando o tipo de dado, o formato de acesso e o objetivo de uso de cada fonte dentro do pipeline analítico. Em relação à versão 1, esta versão incorpora duas novas fontes obtidas via web scraping (BeautifulSoup), com verificação de robots.txt, desenvolvidas na </w:t>
+      </w:r>
+      <w:r>
+        <w:rPr>
+          <w:rFonts w:ascii="Arial" w:hAnsi="Arial" w:cs="Arial"/>
+        </w:rPr>
+        <w:t>versão</w:t>
+      </w:r>
+      <w:r>
+        <w:rPr>
+          <w:rFonts w:ascii="Arial" w:hAnsi="Arial" w:cs="Arial"/>
+        </w:rPr>
+        <w:t xml:space="preserve"> 2 do projeto.</w:t>
       </w:r>
     </w:p>
     <w:p>
@@ -165,11 +129,12 @@
         <w:tblLook w:val="04A0" w:firstRow="1" w:lastRow="0" w:firstColumn="1" w:lastColumn="0" w:noHBand="0" w:noVBand="1"/>
       </w:tblPr>
       <w:tblGrid>
-        <w:gridCol w:w="1935"/>
-        <w:gridCol w:w="1548"/>
-        <w:gridCol w:w="1646"/>
-        <w:gridCol w:w="1296"/>
-        <w:gridCol w:w="2925"/>
+        <w:gridCol w:w="1238"/>
+        <w:gridCol w:w="1835"/>
+        <w:gridCol w:w="1353"/>
+        <w:gridCol w:w="1181"/>
+        <w:gridCol w:w="1476"/>
+        <w:gridCol w:w="2267"/>
       </w:tblGrid>
       <w:tr>
         <w:tblPrEx>
@@ -180,7 +145,7 @@
         </w:tblPrEx>
         <w:tc>
           <w:tcPr>
-            <w:tcW w:w="1600" w:type="dxa"/>
+            <w:tcW w:w="1450" w:type="dxa"/>
             <w:shd w:val="clear" w:color="auto" w:fill="1F6F50"/>
             <w:tcMar>
               <w:top w:w="80" w:type="dxa"/>
@@ -201,8 +166,8 @@
                 <w:b/>
                 <w:bCs/>
                 <w:color w:val="FFFFFF"/>
-                <w:sz w:val="18"/>
-                <w:szCs w:val="18"/>
+                <w:sz w:val="17"/>
+                <w:szCs w:val="17"/>
               </w:rPr>
               <w:t>Fonte</w:t>
             </w:r>
@@ -210,7 +175,7 @@
         </w:tc>
         <w:tc>
           <w:tcPr>
-            <w:tcW w:w="1600" w:type="dxa"/>
+            <w:tcW w:w="1450" w:type="dxa"/>
             <w:shd w:val="clear" w:color="auto" w:fill="1F6F50"/>
             <w:tcMar>
               <w:top w:w="80" w:type="dxa"/>
@@ -231,8 +196,8 @@
                 <w:b/>
                 <w:bCs/>
                 <w:color w:val="FFFFFF"/>
-                <w:sz w:val="18"/>
-                <w:szCs w:val="18"/>
+                <w:sz w:val="17"/>
+                <w:szCs w:val="17"/>
               </w:rPr>
               <w:t>Tipo de Dado</w:t>
             </w:r>
@@ -240,7 +205,7 @@
         </w:tc>
         <w:tc>
           <w:tcPr>
-            <w:tcW w:w="1300" w:type="dxa"/>
+            <w:tcW w:w="1250" w:type="dxa"/>
             <w:shd w:val="clear" w:color="auto" w:fill="1F6F50"/>
             <w:tcMar>
               <w:top w:w="80" w:type="dxa"/>
@@ -261,8 +226,8 @@
                 <w:b/>
                 <w:bCs/>
                 <w:color w:val="FFFFFF"/>
-                <w:sz w:val="18"/>
-                <w:szCs w:val="18"/>
+                <w:sz w:val="17"/>
+                <w:szCs w:val="17"/>
               </w:rPr>
               <w:t>Formato / Acesso</w:t>
             </w:r>
@@ -270,7 +235,7 @@
         </w:tc>
         <w:tc>
           <w:tcPr>
-            <w:tcW w:w="1400" w:type="dxa"/>
+            <w:tcW w:w="1300" w:type="dxa"/>
             <w:shd w:val="clear" w:color="auto" w:fill="1F6F50"/>
             <w:tcMar>
               <w:top w:w="80" w:type="dxa"/>
@@ -291,8 +256,8 @@
                 <w:b/>
                 <w:bCs/>
                 <w:color w:val="FFFFFF"/>
-                <w:sz w:val="18"/>
-                <w:szCs w:val="18"/>
+                <w:sz w:val="17"/>
+                <w:szCs w:val="17"/>
               </w:rPr>
               <w:t>Atualização</w:t>
             </w:r>
@@ -300,7 +265,7 @@
         </w:tc>
         <w:tc>
           <w:tcPr>
-            <w:tcW w:w="3450" w:type="dxa"/>
+            <w:tcW w:w="1300" w:type="dxa"/>
             <w:shd w:val="clear" w:color="auto" w:fill="1F6F50"/>
             <w:tcMar>
               <w:top w:w="80" w:type="dxa"/>
@@ -321,8 +286,38 @@
                 <w:b/>
                 <w:bCs/>
                 <w:color w:val="FFFFFF"/>
-                <w:sz w:val="18"/>
-                <w:szCs w:val="18"/>
+                <w:sz w:val="17"/>
+                <w:szCs w:val="17"/>
+              </w:rPr>
+              <w:t>robots.txt verificado?</w:t>
+            </w:r>
+          </w:p>
+        </w:tc>
+        <w:tc>
+          <w:tcPr>
+            <w:tcW w:w="2600" w:type="dxa"/>
+            <w:shd w:val="clear" w:color="auto" w:fill="1F6F50"/>
+            <w:tcMar>
+              <w:top w:w="80" w:type="dxa"/>
+              <w:left w:w="100" w:type="dxa"/>
+              <w:bottom w:w="80" w:type="dxa"/>
+              <w:right w:w="100" w:type="dxa"/>
+            </w:tcMar>
+          </w:tcPr>
+          <w:p>
+            <w:pPr>
+              <w:rPr>
+                <w:rFonts w:ascii="Arial" w:hAnsi="Arial" w:cs="Arial"/>
+              </w:rPr>
+            </w:pPr>
+            <w:r>
+              <w:rPr>
+                <w:rFonts w:ascii="Arial" w:hAnsi="Arial" w:cs="Arial"/>
+                <w:b/>
+                <w:bCs/>
+                <w:color w:val="FFFFFF"/>
+                <w:sz w:val="17"/>
+                <w:szCs w:val="17"/>
               </w:rPr>
               <w:t>Objetivo de Uso no Projeto</w:t>
             </w:r>
@@ -338,60 +333,82 @@
         </w:tblPrEx>
         <w:tc>
           <w:tcPr>
-            <w:tcW w:w="1600" w:type="dxa"/>
-            <w:tcMar>
-              <w:top w:w="80" w:type="dxa"/>
-              <w:left w:w="100" w:type="dxa"/>
-              <w:bottom w:w="80" w:type="dxa"/>
-              <w:right w:w="100" w:type="dxa"/>
-            </w:tcMar>
-          </w:tcPr>
-          <w:p>
-            <w:pPr>
-              <w:rPr>
-                <w:rFonts w:ascii="Arial" w:hAnsi="Arial" w:cs="Arial"/>
-              </w:rPr>
-            </w:pPr>
-            <w:proofErr w:type="spellStart"/>
-            <w:r>
-              <w:rPr>
-                <w:rFonts w:ascii="Arial" w:hAnsi="Arial" w:cs="Arial"/>
-                <w:color w:val="000000"/>
-              </w:rPr>
-              <w:t>Climatiq</w:t>
-            </w:r>
-            <w:proofErr w:type="spellEnd"/>
-            <w:r>
-              <w:rPr>
-                <w:rFonts w:ascii="Arial" w:hAnsi="Arial" w:cs="Arial"/>
-                <w:color w:val="000000"/>
-              </w:rPr>
-              <w:t xml:space="preserve"> API</w:t>
-            </w:r>
-          </w:p>
-        </w:tc>
-        <w:tc>
-          <w:tcPr>
-            <w:tcW w:w="1600" w:type="dxa"/>
-            <w:tcMar>
-              <w:top w:w="80" w:type="dxa"/>
-              <w:left w:w="100" w:type="dxa"/>
-              <w:bottom w:w="80" w:type="dxa"/>
-              <w:right w:w="100" w:type="dxa"/>
-            </w:tcMar>
-          </w:tcPr>
-          <w:p>
-            <w:pPr>
-              <w:rPr>
-                <w:rFonts w:ascii="Arial" w:hAnsi="Arial" w:cs="Arial"/>
-              </w:rPr>
-            </w:pPr>
-            <w:r>
-              <w:rPr>
-                <w:rFonts w:ascii="Arial" w:hAnsi="Arial" w:cs="Arial"/>
-                <w:color w:val="000000"/>
-              </w:rPr>
-              <w:t>Fatores de emissão (kg CO2e por unidade de atividade: energia, combustível, transporte)</w:t>
+            <w:tcW w:w="1450" w:type="dxa"/>
+            <w:tcMar>
+              <w:top w:w="80" w:type="dxa"/>
+              <w:left w:w="100" w:type="dxa"/>
+              <w:bottom w:w="80" w:type="dxa"/>
+              <w:right w:w="100" w:type="dxa"/>
+            </w:tcMar>
+          </w:tcPr>
+          <w:p>
+            <w:pPr>
+              <w:rPr>
+                <w:rFonts w:ascii="Arial" w:hAnsi="Arial" w:cs="Arial"/>
+              </w:rPr>
+            </w:pPr>
+            <w:r>
+              <w:rPr>
+                <w:rFonts w:ascii="Arial" w:hAnsi="Arial" w:cs="Arial"/>
+                <w:color w:val="000000"/>
+                <w:sz w:val="17"/>
+                <w:szCs w:val="17"/>
+              </w:rPr>
+              <w:t>Climatiq API</w:t>
+            </w:r>
+          </w:p>
+        </w:tc>
+        <w:tc>
+          <w:tcPr>
+            <w:tcW w:w="1450" w:type="dxa"/>
+            <w:tcMar>
+              <w:top w:w="80" w:type="dxa"/>
+              <w:left w:w="100" w:type="dxa"/>
+              <w:bottom w:w="80" w:type="dxa"/>
+              <w:right w:w="100" w:type="dxa"/>
+            </w:tcMar>
+          </w:tcPr>
+          <w:p>
+            <w:pPr>
+              <w:rPr>
+                <w:rFonts w:ascii="Arial" w:hAnsi="Arial" w:cs="Arial"/>
+              </w:rPr>
+            </w:pPr>
+            <w:r>
+              <w:rPr>
+                <w:rFonts w:ascii="Arial" w:hAnsi="Arial" w:cs="Arial"/>
+                <w:color w:val="000000"/>
+                <w:sz w:val="17"/>
+                <w:szCs w:val="17"/>
+              </w:rPr>
+              <w:t>Fatores de emissão (kg CO2e por unidade de atividade)</w:t>
+            </w:r>
+          </w:p>
+        </w:tc>
+        <w:tc>
+          <w:tcPr>
+            <w:tcW w:w="1250" w:type="dxa"/>
+            <w:tcMar>
+              <w:top w:w="80" w:type="dxa"/>
+              <w:left w:w="100" w:type="dxa"/>
+              <w:bottom w:w="80" w:type="dxa"/>
+              <w:right w:w="100" w:type="dxa"/>
+            </w:tcMar>
+          </w:tcPr>
+          <w:p>
+            <w:pPr>
+              <w:rPr>
+                <w:rFonts w:ascii="Arial" w:hAnsi="Arial" w:cs="Arial"/>
+              </w:rPr>
+            </w:pPr>
+            <w:r>
+              <w:rPr>
+                <w:rFonts w:ascii="Arial" w:hAnsi="Arial" w:cs="Arial"/>
+                <w:color w:val="000000"/>
+                <w:sz w:val="17"/>
+                <w:szCs w:val="17"/>
+              </w:rPr>
+              <w:t>REST API (JSON), API key</w:t>
             </w:r>
           </w:p>
         </w:tc>
@@ -415,67 +432,64 @@
               <w:rPr>
                 <w:rFonts w:ascii="Arial" w:hAnsi="Arial" w:cs="Arial"/>
                 <w:color w:val="000000"/>
-              </w:rPr>
-              <w:t xml:space="preserve">REST API (JSON), autenticação via API </w:t>
-            </w:r>
-            <w:proofErr w:type="spellStart"/>
-            <w:r>
-              <w:rPr>
-                <w:rFonts w:ascii="Arial" w:hAnsi="Arial" w:cs="Arial"/>
-                <w:color w:val="000000"/>
-              </w:rPr>
-              <w:t>key</w:t>
-            </w:r>
-            <w:proofErr w:type="spellEnd"/>
-          </w:p>
-        </w:tc>
-        <w:tc>
-          <w:tcPr>
-            <w:tcW w:w="1400" w:type="dxa"/>
-            <w:tcMar>
-              <w:top w:w="80" w:type="dxa"/>
-              <w:left w:w="100" w:type="dxa"/>
-              <w:bottom w:w="80" w:type="dxa"/>
-              <w:right w:w="100" w:type="dxa"/>
-            </w:tcMar>
-          </w:tcPr>
-          <w:p>
-            <w:pPr>
-              <w:rPr>
-                <w:rFonts w:ascii="Arial" w:hAnsi="Arial" w:cs="Arial"/>
-              </w:rPr>
-            </w:pPr>
-            <w:r>
-              <w:rPr>
-                <w:rFonts w:ascii="Arial" w:hAnsi="Arial" w:cs="Arial"/>
-                <w:color w:val="000000"/>
-              </w:rPr>
-              <w:t>Contínua (base atualizada pelo provedor)</w:t>
-            </w:r>
-          </w:p>
-        </w:tc>
-        <w:tc>
-          <w:tcPr>
-            <w:tcW w:w="3450" w:type="dxa"/>
-            <w:tcMar>
-              <w:top w:w="80" w:type="dxa"/>
-              <w:left w:w="100" w:type="dxa"/>
-              <w:bottom w:w="80" w:type="dxa"/>
-              <w:right w:w="100" w:type="dxa"/>
-            </w:tcMar>
-          </w:tcPr>
-          <w:p>
-            <w:pPr>
-              <w:rPr>
-                <w:rFonts w:ascii="Arial" w:hAnsi="Arial" w:cs="Arial"/>
-              </w:rPr>
-            </w:pPr>
-            <w:r>
-              <w:rPr>
-                <w:rFonts w:ascii="Arial" w:hAnsi="Arial" w:cs="Arial"/>
-                <w:color w:val="000000"/>
-              </w:rPr>
-              <w:t>Converter dados de consumo/atividade em emissões de CO2e; base para o cálculo do Escopo 1 e 2</w:t>
+                <w:sz w:val="17"/>
+                <w:szCs w:val="17"/>
+              </w:rPr>
+              <w:t>Contínua</w:t>
+            </w:r>
+          </w:p>
+        </w:tc>
+        <w:tc>
+          <w:tcPr>
+            <w:tcW w:w="1300" w:type="dxa"/>
+            <w:tcMar>
+              <w:top w:w="80" w:type="dxa"/>
+              <w:left w:w="100" w:type="dxa"/>
+              <w:bottom w:w="80" w:type="dxa"/>
+              <w:right w:w="100" w:type="dxa"/>
+            </w:tcMar>
+          </w:tcPr>
+          <w:p>
+            <w:pPr>
+              <w:rPr>
+                <w:rFonts w:ascii="Arial" w:hAnsi="Arial" w:cs="Arial"/>
+              </w:rPr>
+            </w:pPr>
+            <w:r>
+              <w:rPr>
+                <w:rFonts w:ascii="Arial" w:hAnsi="Arial" w:cs="Arial"/>
+                <w:color w:val="000000"/>
+                <w:sz w:val="17"/>
+                <w:szCs w:val="17"/>
+              </w:rPr>
+              <w:t>N/A (API oficial, não é scraping)</w:t>
+            </w:r>
+          </w:p>
+        </w:tc>
+        <w:tc>
+          <w:tcPr>
+            <w:tcW w:w="2600" w:type="dxa"/>
+            <w:tcMar>
+              <w:top w:w="80" w:type="dxa"/>
+              <w:left w:w="100" w:type="dxa"/>
+              <w:bottom w:w="80" w:type="dxa"/>
+              <w:right w:w="100" w:type="dxa"/>
+            </w:tcMar>
+          </w:tcPr>
+          <w:p>
+            <w:pPr>
+              <w:rPr>
+                <w:rFonts w:ascii="Arial" w:hAnsi="Arial" w:cs="Arial"/>
+              </w:rPr>
+            </w:pPr>
+            <w:r>
+              <w:rPr>
+                <w:rFonts w:ascii="Arial" w:hAnsi="Arial" w:cs="Arial"/>
+                <w:color w:val="000000"/>
+                <w:sz w:val="17"/>
+                <w:szCs w:val="17"/>
+              </w:rPr>
+              <w:t>Converter dados de consumo/atividade em emissões de CO2e (Escopo 1 e 2)</w:t>
             </w:r>
           </w:p>
         </w:tc>
@@ -489,49 +503,53 @@
         </w:tblPrEx>
         <w:tc>
           <w:tcPr>
-            <w:tcW w:w="1600" w:type="dxa"/>
-            <w:tcMar>
-              <w:top w:w="80" w:type="dxa"/>
-              <w:left w:w="100" w:type="dxa"/>
-              <w:bottom w:w="80" w:type="dxa"/>
-              <w:right w:w="100" w:type="dxa"/>
-            </w:tcMar>
-          </w:tcPr>
-          <w:p>
-            <w:pPr>
-              <w:rPr>
-                <w:rFonts w:ascii="Arial" w:hAnsi="Arial" w:cs="Arial"/>
-              </w:rPr>
-            </w:pPr>
-            <w:r>
-              <w:rPr>
-                <w:rFonts w:ascii="Arial" w:hAnsi="Arial" w:cs="Arial"/>
-                <w:color w:val="000000"/>
-              </w:rPr>
-              <w:t>SEEG / Observatório do Clima (Brasil)</w:t>
-            </w:r>
-          </w:p>
-        </w:tc>
-        <w:tc>
-          <w:tcPr>
-            <w:tcW w:w="1600" w:type="dxa"/>
-            <w:tcMar>
-              <w:top w:w="80" w:type="dxa"/>
-              <w:left w:w="100" w:type="dxa"/>
-              <w:bottom w:w="80" w:type="dxa"/>
-              <w:right w:w="100" w:type="dxa"/>
-            </w:tcMar>
-          </w:tcPr>
-          <w:p>
-            <w:pPr>
-              <w:rPr>
-                <w:rFonts w:ascii="Arial" w:hAnsi="Arial" w:cs="Arial"/>
-              </w:rPr>
-            </w:pPr>
-            <w:r>
-              <w:rPr>
-                <w:rFonts w:ascii="Arial" w:hAnsi="Arial" w:cs="Arial"/>
-                <w:color w:val="000000"/>
+            <w:tcW w:w="1450" w:type="dxa"/>
+            <w:tcMar>
+              <w:top w:w="80" w:type="dxa"/>
+              <w:left w:w="100" w:type="dxa"/>
+              <w:bottom w:w="80" w:type="dxa"/>
+              <w:right w:w="100" w:type="dxa"/>
+            </w:tcMar>
+          </w:tcPr>
+          <w:p>
+            <w:pPr>
+              <w:rPr>
+                <w:rFonts w:ascii="Arial" w:hAnsi="Arial" w:cs="Arial"/>
+              </w:rPr>
+            </w:pPr>
+            <w:r>
+              <w:rPr>
+                <w:rFonts w:ascii="Arial" w:hAnsi="Arial" w:cs="Arial"/>
+                <w:color w:val="000000"/>
+                <w:sz w:val="17"/>
+                <w:szCs w:val="17"/>
+              </w:rPr>
+              <w:t>SEEG / Observatório do Clima</w:t>
+            </w:r>
+          </w:p>
+        </w:tc>
+        <w:tc>
+          <w:tcPr>
+            <w:tcW w:w="1450" w:type="dxa"/>
+            <w:tcMar>
+              <w:top w:w="80" w:type="dxa"/>
+              <w:left w:w="100" w:type="dxa"/>
+              <w:bottom w:w="80" w:type="dxa"/>
+              <w:right w:w="100" w:type="dxa"/>
+            </w:tcMar>
+          </w:tcPr>
+          <w:p>
+            <w:pPr>
+              <w:rPr>
+                <w:rFonts w:ascii="Arial" w:hAnsi="Arial" w:cs="Arial"/>
+              </w:rPr>
+            </w:pPr>
+            <w:r>
+              <w:rPr>
+                <w:rFonts w:ascii="Arial" w:hAnsi="Arial" w:cs="Arial"/>
+                <w:color w:val="000000"/>
+                <w:sz w:val="17"/>
+                <w:szCs w:val="17"/>
               </w:rPr>
               <w:t>Séries históricas de emissões setoriais no Brasil</w:t>
             </w:r>
@@ -539,6 +557,33 @@
         </w:tc>
         <w:tc>
           <w:tcPr>
+            <w:tcW w:w="1250" w:type="dxa"/>
+            <w:tcMar>
+              <w:top w:w="80" w:type="dxa"/>
+              <w:left w:w="100" w:type="dxa"/>
+              <w:bottom w:w="80" w:type="dxa"/>
+              <w:right w:w="100" w:type="dxa"/>
+            </w:tcMar>
+          </w:tcPr>
+          <w:p>
+            <w:pPr>
+              <w:rPr>
+                <w:rFonts w:ascii="Arial" w:hAnsi="Arial" w:cs="Arial"/>
+              </w:rPr>
+            </w:pPr>
+            <w:r>
+              <w:rPr>
+                <w:rFonts w:ascii="Arial" w:hAnsi="Arial" w:cs="Arial"/>
+                <w:color w:val="000000"/>
+                <w:sz w:val="17"/>
+                <w:szCs w:val="17"/>
+              </w:rPr>
+              <w:t>Download de dados abertos</w:t>
+            </w:r>
+          </w:p>
+        </w:tc>
+        <w:tc>
+          <w:tcPr>
             <w:tcW w:w="1300" w:type="dxa"/>
             <w:tcMar>
               <w:top w:w="80" w:type="dxa"/>
@@ -557,31 +602,8 @@
               <w:rPr>
                 <w:rFonts w:ascii="Arial" w:hAnsi="Arial" w:cs="Arial"/>
                 <w:color w:val="000000"/>
-              </w:rPr>
-              <w:t>Download de planilhas / dados abertos</w:t>
-            </w:r>
-          </w:p>
-        </w:tc>
-        <w:tc>
-          <w:tcPr>
-            <w:tcW w:w="1400" w:type="dxa"/>
-            <w:tcMar>
-              <w:top w:w="80" w:type="dxa"/>
-              <w:left w:w="100" w:type="dxa"/>
-              <w:bottom w:w="80" w:type="dxa"/>
-              <w:right w:w="100" w:type="dxa"/>
-            </w:tcMar>
-          </w:tcPr>
-          <w:p>
-            <w:pPr>
-              <w:rPr>
-                <w:rFonts w:ascii="Arial" w:hAnsi="Arial" w:cs="Arial"/>
-              </w:rPr>
-            </w:pPr>
-            <w:r>
-              <w:rPr>
-                <w:rFonts w:ascii="Arial" w:hAnsi="Arial" w:cs="Arial"/>
-                <w:color w:val="000000"/>
+                <w:sz w:val="17"/>
+                <w:szCs w:val="17"/>
               </w:rPr>
               <w:t>Anual</w:t>
             </w:r>
@@ -589,26 +611,55 @@
         </w:tc>
         <w:tc>
           <w:tcPr>
-            <w:tcW w:w="3450" w:type="dxa"/>
-            <w:tcMar>
-              <w:top w:w="80" w:type="dxa"/>
-              <w:left w:w="100" w:type="dxa"/>
-              <w:bottom w:w="80" w:type="dxa"/>
-              <w:right w:w="100" w:type="dxa"/>
-            </w:tcMar>
-          </w:tcPr>
-          <w:p>
-            <w:pPr>
-              <w:rPr>
-                <w:rFonts w:ascii="Arial" w:hAnsi="Arial" w:cs="Arial"/>
-              </w:rPr>
-            </w:pPr>
-            <w:r>
-              <w:rPr>
-                <w:rFonts w:ascii="Arial" w:hAnsi="Arial" w:cs="Arial"/>
-                <w:color w:val="000000"/>
-              </w:rPr>
-              <w:t>Servir de benchmark setorial/nacional para contextualizar e validar a magnitude das emissões calculadas</w:t>
+            <w:tcW w:w="1300" w:type="dxa"/>
+            <w:tcMar>
+              <w:top w:w="80" w:type="dxa"/>
+              <w:left w:w="100" w:type="dxa"/>
+              <w:bottom w:w="80" w:type="dxa"/>
+              <w:right w:w="100" w:type="dxa"/>
+            </w:tcMar>
+          </w:tcPr>
+          <w:p>
+            <w:pPr>
+              <w:rPr>
+                <w:rFonts w:ascii="Arial" w:hAnsi="Arial" w:cs="Arial"/>
+              </w:rPr>
+            </w:pPr>
+            <w:r>
+              <w:rPr>
+                <w:rFonts w:ascii="Arial" w:hAnsi="Arial" w:cs="Arial"/>
+                <w:color w:val="000000"/>
+                <w:sz w:val="17"/>
+                <w:szCs w:val="17"/>
+              </w:rPr>
+              <w:t>N/A (dados abertos, download direto)</w:t>
+            </w:r>
+          </w:p>
+        </w:tc>
+        <w:tc>
+          <w:tcPr>
+            <w:tcW w:w="2600" w:type="dxa"/>
+            <w:tcMar>
+              <w:top w:w="80" w:type="dxa"/>
+              <w:left w:w="100" w:type="dxa"/>
+              <w:bottom w:w="80" w:type="dxa"/>
+              <w:right w:w="100" w:type="dxa"/>
+            </w:tcMar>
+          </w:tcPr>
+          <w:p>
+            <w:pPr>
+              <w:rPr>
+                <w:rFonts w:ascii="Arial" w:hAnsi="Arial" w:cs="Arial"/>
+              </w:rPr>
+            </w:pPr>
+            <w:r>
+              <w:rPr>
+                <w:rFonts w:ascii="Arial" w:hAnsi="Arial" w:cs="Arial"/>
+                <w:color w:val="000000"/>
+                <w:sz w:val="17"/>
+                <w:szCs w:val="17"/>
+              </w:rPr>
+              <w:t>Benchmark setorial/nacional para validar a magnitude das emissões calculadas</w:t>
             </w:r>
           </w:p>
         </w:tc>
@@ -622,24 +673,26 @@
         </w:tblPrEx>
         <w:tc>
           <w:tcPr>
-            <w:tcW w:w="1600" w:type="dxa"/>
-            <w:tcMar>
-              <w:top w:w="80" w:type="dxa"/>
-              <w:left w:w="100" w:type="dxa"/>
-              <w:bottom w:w="80" w:type="dxa"/>
-              <w:right w:w="100" w:type="dxa"/>
-            </w:tcMar>
-          </w:tcPr>
-          <w:p>
-            <w:pPr>
-              <w:rPr>
-                <w:rFonts w:ascii="Arial" w:hAnsi="Arial" w:cs="Arial"/>
-              </w:rPr>
-            </w:pPr>
-            <w:r>
-              <w:rPr>
-                <w:rFonts w:ascii="Arial" w:hAnsi="Arial" w:cs="Arial"/>
-                <w:color w:val="000000"/>
+            <w:tcW w:w="1450" w:type="dxa"/>
+            <w:tcMar>
+              <w:top w:w="80" w:type="dxa"/>
+              <w:left w:w="100" w:type="dxa"/>
+              <w:bottom w:w="80" w:type="dxa"/>
+              <w:right w:w="100" w:type="dxa"/>
+            </w:tcMar>
+          </w:tcPr>
+          <w:p>
+            <w:pPr>
+              <w:rPr>
+                <w:rFonts w:ascii="Arial" w:hAnsi="Arial" w:cs="Arial"/>
+              </w:rPr>
+            </w:pPr>
+            <w:r>
+              <w:rPr>
+                <w:rFonts w:ascii="Arial" w:hAnsi="Arial" w:cs="Arial"/>
+                <w:color w:val="000000"/>
+                <w:sz w:val="17"/>
+                <w:szCs w:val="17"/>
               </w:rPr>
               <w:t>EPA (EUA) / DEFRA (Reino Unido)</w:t>
             </w:r>
@@ -647,26 +700,55 @@
         </w:tc>
         <w:tc>
           <w:tcPr>
-            <w:tcW w:w="1600" w:type="dxa"/>
-            <w:tcMar>
-              <w:top w:w="80" w:type="dxa"/>
-              <w:left w:w="100" w:type="dxa"/>
-              <w:bottom w:w="80" w:type="dxa"/>
-              <w:right w:w="100" w:type="dxa"/>
-            </w:tcMar>
-          </w:tcPr>
-          <w:p>
-            <w:pPr>
-              <w:rPr>
-                <w:rFonts w:ascii="Arial" w:hAnsi="Arial" w:cs="Arial"/>
-              </w:rPr>
-            </w:pPr>
-            <w:r>
-              <w:rPr>
-                <w:rFonts w:ascii="Arial" w:hAnsi="Arial" w:cs="Arial"/>
-                <w:color w:val="000000"/>
-              </w:rPr>
-              <w:t>Fatores de emissão por tipo de combustível e atividade (padrões internacionais)</w:t>
+            <w:tcW w:w="1450" w:type="dxa"/>
+            <w:tcMar>
+              <w:top w:w="80" w:type="dxa"/>
+              <w:left w:w="100" w:type="dxa"/>
+              <w:bottom w:w="80" w:type="dxa"/>
+              <w:right w:w="100" w:type="dxa"/>
+            </w:tcMar>
+          </w:tcPr>
+          <w:p>
+            <w:pPr>
+              <w:rPr>
+                <w:rFonts w:ascii="Arial" w:hAnsi="Arial" w:cs="Arial"/>
+              </w:rPr>
+            </w:pPr>
+            <w:r>
+              <w:rPr>
+                <w:rFonts w:ascii="Arial" w:hAnsi="Arial" w:cs="Arial"/>
+                <w:color w:val="000000"/>
+                <w:sz w:val="17"/>
+                <w:szCs w:val="17"/>
+              </w:rPr>
+              <w:t>Fatores de emissão por tipo de combustível/atividade</w:t>
+            </w:r>
+          </w:p>
+        </w:tc>
+        <w:tc>
+          <w:tcPr>
+            <w:tcW w:w="1250" w:type="dxa"/>
+            <w:tcMar>
+              <w:top w:w="80" w:type="dxa"/>
+              <w:left w:w="100" w:type="dxa"/>
+              <w:bottom w:w="80" w:type="dxa"/>
+              <w:right w:w="100" w:type="dxa"/>
+            </w:tcMar>
+          </w:tcPr>
+          <w:p>
+            <w:pPr>
+              <w:rPr>
+                <w:rFonts w:ascii="Arial" w:hAnsi="Arial" w:cs="Arial"/>
+              </w:rPr>
+            </w:pPr>
+            <w:r>
+              <w:rPr>
+                <w:rFonts w:ascii="Arial" w:hAnsi="Arial" w:cs="Arial"/>
+                <w:color w:val="000000"/>
+                <w:sz w:val="17"/>
+                <w:szCs w:val="17"/>
+              </w:rPr>
+              <w:t>Planilhas públicas (CSV/XLSX)</w:t>
             </w:r>
           </w:p>
         </w:tc>
@@ -690,31 +772,8 @@
               <w:rPr>
                 <w:rFonts w:ascii="Arial" w:hAnsi="Arial" w:cs="Arial"/>
                 <w:color w:val="000000"/>
-              </w:rPr>
-              <w:t>Planilhas públicas (CSV/XLSX)</w:t>
-            </w:r>
-          </w:p>
-        </w:tc>
-        <w:tc>
-          <w:tcPr>
-            <w:tcW w:w="1400" w:type="dxa"/>
-            <w:tcMar>
-              <w:top w:w="80" w:type="dxa"/>
-              <w:left w:w="100" w:type="dxa"/>
-              <w:bottom w:w="80" w:type="dxa"/>
-              <w:right w:w="100" w:type="dxa"/>
-            </w:tcMar>
-          </w:tcPr>
-          <w:p>
-            <w:pPr>
-              <w:rPr>
-                <w:rFonts w:ascii="Arial" w:hAnsi="Arial" w:cs="Arial"/>
-              </w:rPr>
-            </w:pPr>
-            <w:r>
-              <w:rPr>
-                <w:rFonts w:ascii="Arial" w:hAnsi="Arial" w:cs="Arial"/>
-                <w:color w:val="000000"/>
+                <w:sz w:val="17"/>
+                <w:szCs w:val="17"/>
               </w:rPr>
               <w:t>Anual</w:t>
             </w:r>
@@ -722,42 +781,55 @@
         </w:tc>
         <w:tc>
           <w:tcPr>
-            <w:tcW w:w="3450" w:type="dxa"/>
-            <w:tcMar>
-              <w:top w:w="80" w:type="dxa"/>
-              <w:left w:w="100" w:type="dxa"/>
-              <w:bottom w:w="80" w:type="dxa"/>
-              <w:right w:w="100" w:type="dxa"/>
-            </w:tcMar>
-          </w:tcPr>
-          <w:p>
-            <w:pPr>
-              <w:rPr>
-                <w:rFonts w:ascii="Arial" w:hAnsi="Arial" w:cs="Arial"/>
-              </w:rPr>
-            </w:pPr>
-            <w:r>
-              <w:rPr>
-                <w:rFonts w:ascii="Arial" w:hAnsi="Arial" w:cs="Arial"/>
-                <w:color w:val="000000"/>
-              </w:rPr>
-              <w:t xml:space="preserve">Fonte alternativa/complementar de fatores de emissão, útil para checagem cruzada com a </w:t>
-            </w:r>
-            <w:proofErr w:type="spellStart"/>
-            <w:r>
-              <w:rPr>
-                <w:rFonts w:ascii="Arial" w:hAnsi="Arial" w:cs="Arial"/>
-                <w:color w:val="000000"/>
-              </w:rPr>
-              <w:t>Climatiq</w:t>
-            </w:r>
-            <w:proofErr w:type="spellEnd"/>
-            <w:r>
-              <w:rPr>
-                <w:rFonts w:ascii="Arial" w:hAnsi="Arial" w:cs="Arial"/>
-                <w:color w:val="000000"/>
-              </w:rPr>
-              <w:t xml:space="preserve"> API</w:t>
+            <w:tcW w:w="1300" w:type="dxa"/>
+            <w:tcMar>
+              <w:top w:w="80" w:type="dxa"/>
+              <w:left w:w="100" w:type="dxa"/>
+              <w:bottom w:w="80" w:type="dxa"/>
+              <w:right w:w="100" w:type="dxa"/>
+            </w:tcMar>
+          </w:tcPr>
+          <w:p>
+            <w:pPr>
+              <w:rPr>
+                <w:rFonts w:ascii="Arial" w:hAnsi="Arial" w:cs="Arial"/>
+              </w:rPr>
+            </w:pPr>
+            <w:r>
+              <w:rPr>
+                <w:rFonts w:ascii="Arial" w:hAnsi="Arial" w:cs="Arial"/>
+                <w:color w:val="000000"/>
+                <w:sz w:val="17"/>
+                <w:szCs w:val="17"/>
+              </w:rPr>
+              <w:t>N/A (dados abertos, download direto)</w:t>
+            </w:r>
+          </w:p>
+        </w:tc>
+        <w:tc>
+          <w:tcPr>
+            <w:tcW w:w="2600" w:type="dxa"/>
+            <w:tcMar>
+              <w:top w:w="80" w:type="dxa"/>
+              <w:left w:w="100" w:type="dxa"/>
+              <w:bottom w:w="80" w:type="dxa"/>
+              <w:right w:w="100" w:type="dxa"/>
+            </w:tcMar>
+          </w:tcPr>
+          <w:p>
+            <w:pPr>
+              <w:rPr>
+                <w:rFonts w:ascii="Arial" w:hAnsi="Arial" w:cs="Arial"/>
+              </w:rPr>
+            </w:pPr>
+            <w:r>
+              <w:rPr>
+                <w:rFonts w:ascii="Arial" w:hAnsi="Arial" w:cs="Arial"/>
+                <w:color w:val="000000"/>
+                <w:sz w:val="17"/>
+                <w:szCs w:val="17"/>
+              </w:rPr>
+              <w:t>Fonte alternativa de fatores de emissão para checagem cruzada com a Climatiq API</w:t>
             </w:r>
           </w:p>
         </w:tc>
@@ -771,24 +843,26 @@
         </w:tblPrEx>
         <w:tc>
           <w:tcPr>
-            <w:tcW w:w="1600" w:type="dxa"/>
-            <w:tcMar>
-              <w:top w:w="80" w:type="dxa"/>
-              <w:left w:w="100" w:type="dxa"/>
-              <w:bottom w:w="80" w:type="dxa"/>
-              <w:right w:w="100" w:type="dxa"/>
-            </w:tcMar>
-          </w:tcPr>
-          <w:p>
-            <w:pPr>
-              <w:rPr>
-                <w:rFonts w:ascii="Arial" w:hAnsi="Arial" w:cs="Arial"/>
-              </w:rPr>
-            </w:pPr>
-            <w:r>
-              <w:rPr>
-                <w:rFonts w:ascii="Arial" w:hAnsi="Arial" w:cs="Arial"/>
-                <w:color w:val="000000"/>
+            <w:tcW w:w="1450" w:type="dxa"/>
+            <w:tcMar>
+              <w:top w:w="80" w:type="dxa"/>
+              <w:left w:w="100" w:type="dxa"/>
+              <w:bottom w:w="80" w:type="dxa"/>
+              <w:right w:w="100" w:type="dxa"/>
+            </w:tcMar>
+          </w:tcPr>
+          <w:p>
+            <w:pPr>
+              <w:rPr>
+                <w:rFonts w:ascii="Arial" w:hAnsi="Arial" w:cs="Arial"/>
+              </w:rPr>
+            </w:pPr>
+            <w:r>
+              <w:rPr>
+                <w:rFonts w:ascii="Arial" w:hAnsi="Arial" w:cs="Arial"/>
+                <w:color w:val="000000"/>
+                <w:sz w:val="17"/>
+                <w:szCs w:val="17"/>
               </w:rPr>
               <w:t>Dados internos simulados</w:t>
             </w:r>
@@ -796,26 +870,55 @@
         </w:tc>
         <w:tc>
           <w:tcPr>
-            <w:tcW w:w="1600" w:type="dxa"/>
-            <w:tcMar>
-              <w:top w:w="80" w:type="dxa"/>
-              <w:left w:w="100" w:type="dxa"/>
-              <w:bottom w:w="80" w:type="dxa"/>
-              <w:right w:w="100" w:type="dxa"/>
-            </w:tcMar>
-          </w:tcPr>
-          <w:p>
-            <w:pPr>
-              <w:rPr>
-                <w:rFonts w:ascii="Arial" w:hAnsi="Arial" w:cs="Arial"/>
-              </w:rPr>
-            </w:pPr>
-            <w:r>
-              <w:rPr>
-                <w:rFonts w:ascii="Arial" w:hAnsi="Arial" w:cs="Arial"/>
-                <w:color w:val="000000"/>
-              </w:rPr>
-              <w:t>Consumo de energia elétrica (kWh), consumo de combustível da frota (litros), km rodados, por unidade/mês</w:t>
+            <w:tcW w:w="1450" w:type="dxa"/>
+            <w:tcMar>
+              <w:top w:w="80" w:type="dxa"/>
+              <w:left w:w="100" w:type="dxa"/>
+              <w:bottom w:w="80" w:type="dxa"/>
+              <w:right w:w="100" w:type="dxa"/>
+            </w:tcMar>
+          </w:tcPr>
+          <w:p>
+            <w:pPr>
+              <w:rPr>
+                <w:rFonts w:ascii="Arial" w:hAnsi="Arial" w:cs="Arial"/>
+              </w:rPr>
+            </w:pPr>
+            <w:r>
+              <w:rPr>
+                <w:rFonts w:ascii="Arial" w:hAnsi="Arial" w:cs="Arial"/>
+                <w:color w:val="000000"/>
+                <w:sz w:val="17"/>
+                <w:szCs w:val="17"/>
+              </w:rPr>
+              <w:t>Consumo de energia, combustível de frota e insumos por unidade/mês</w:t>
+            </w:r>
+          </w:p>
+        </w:tc>
+        <w:tc>
+          <w:tcPr>
+            <w:tcW w:w="1250" w:type="dxa"/>
+            <w:tcMar>
+              <w:top w:w="80" w:type="dxa"/>
+              <w:left w:w="100" w:type="dxa"/>
+              <w:bottom w:w="80" w:type="dxa"/>
+              <w:right w:w="100" w:type="dxa"/>
+            </w:tcMar>
+          </w:tcPr>
+          <w:p>
+            <w:pPr>
+              <w:rPr>
+                <w:rFonts w:ascii="Arial" w:hAnsi="Arial" w:cs="Arial"/>
+              </w:rPr>
+            </w:pPr>
+            <w:r>
+              <w:rPr>
+                <w:rFonts w:ascii="Arial" w:hAnsi="Arial" w:cs="Arial"/>
+                <w:color w:val="000000"/>
+                <w:sz w:val="17"/>
+                <w:szCs w:val="17"/>
+              </w:rPr>
+              <w:t>CSV gerado em Python</w:t>
             </w:r>
           </w:p>
         </w:tc>
@@ -839,47 +942,8 @@
               <w:rPr>
                 <w:rFonts w:ascii="Arial" w:hAnsi="Arial" w:cs="Arial"/>
                 <w:color w:val="000000"/>
-              </w:rPr>
-              <w:t>CSV gerado sinteticamente em Python (</w:t>
-            </w:r>
-            <w:proofErr w:type="spellStart"/>
-            <w:r>
-              <w:rPr>
-                <w:rFonts w:ascii="Arial" w:hAnsi="Arial" w:cs="Arial"/>
-                <w:color w:val="000000"/>
-              </w:rPr>
-              <w:t>numpy</w:t>
-            </w:r>
-            <w:proofErr w:type="spellEnd"/>
-            <w:r>
-              <w:rPr>
-                <w:rFonts w:ascii="Arial" w:hAnsi="Arial" w:cs="Arial"/>
-                <w:color w:val="000000"/>
-              </w:rPr>
-              <w:t>/pandas)</w:t>
-            </w:r>
-          </w:p>
-        </w:tc>
-        <w:tc>
-          <w:tcPr>
-            <w:tcW w:w="1400" w:type="dxa"/>
-            <w:tcMar>
-              <w:top w:w="80" w:type="dxa"/>
-              <w:left w:w="100" w:type="dxa"/>
-              <w:bottom w:w="80" w:type="dxa"/>
-              <w:right w:w="100" w:type="dxa"/>
-            </w:tcMar>
-          </w:tcPr>
-          <w:p>
-            <w:pPr>
-              <w:rPr>
-                <w:rFonts w:ascii="Arial" w:hAnsi="Arial" w:cs="Arial"/>
-              </w:rPr>
-            </w:pPr>
-            <w:r>
-              <w:rPr>
-                <w:rFonts w:ascii="Arial" w:hAnsi="Arial" w:cs="Arial"/>
-                <w:color w:val="000000"/>
+                <w:sz w:val="17"/>
+                <w:szCs w:val="17"/>
               </w:rPr>
               <w:t>Mensal (simulado)</w:t>
             </w:r>
@@ -887,26 +951,55 @@
         </w:tc>
         <w:tc>
           <w:tcPr>
-            <w:tcW w:w="3450" w:type="dxa"/>
-            <w:tcMar>
-              <w:top w:w="80" w:type="dxa"/>
-              <w:left w:w="100" w:type="dxa"/>
-              <w:bottom w:w="80" w:type="dxa"/>
-              <w:right w:w="100" w:type="dxa"/>
-            </w:tcMar>
-          </w:tcPr>
-          <w:p>
-            <w:pPr>
-              <w:rPr>
-                <w:rFonts w:ascii="Arial" w:hAnsi="Arial" w:cs="Arial"/>
-              </w:rPr>
-            </w:pPr>
-            <w:r>
-              <w:rPr>
-                <w:rFonts w:ascii="Arial" w:hAnsi="Arial" w:cs="Arial"/>
-                <w:color w:val="000000"/>
-              </w:rPr>
-              <w:t>Representar os dados operacionais da empresa (ausentes no mundo real deste projeto), usados como variável de atividade para o cálculo de emissões</w:t>
+            <w:tcW w:w="1300" w:type="dxa"/>
+            <w:tcMar>
+              <w:top w:w="80" w:type="dxa"/>
+              <w:left w:w="100" w:type="dxa"/>
+              <w:bottom w:w="80" w:type="dxa"/>
+              <w:right w:w="100" w:type="dxa"/>
+            </w:tcMar>
+          </w:tcPr>
+          <w:p>
+            <w:pPr>
+              <w:rPr>
+                <w:rFonts w:ascii="Arial" w:hAnsi="Arial" w:cs="Arial"/>
+              </w:rPr>
+            </w:pPr>
+            <w:r>
+              <w:rPr>
+                <w:rFonts w:ascii="Arial" w:hAnsi="Arial" w:cs="Arial"/>
+                <w:color w:val="000000"/>
+                <w:sz w:val="17"/>
+                <w:szCs w:val="17"/>
+              </w:rPr>
+              <w:t>N/A (não é coleta externa)</w:t>
+            </w:r>
+          </w:p>
+        </w:tc>
+        <w:tc>
+          <w:tcPr>
+            <w:tcW w:w="2600" w:type="dxa"/>
+            <w:tcMar>
+              <w:top w:w="80" w:type="dxa"/>
+              <w:left w:w="100" w:type="dxa"/>
+              <w:bottom w:w="80" w:type="dxa"/>
+              <w:right w:w="100" w:type="dxa"/>
+            </w:tcMar>
+          </w:tcPr>
+          <w:p>
+            <w:pPr>
+              <w:rPr>
+                <w:rFonts w:ascii="Arial" w:hAnsi="Arial" w:cs="Arial"/>
+              </w:rPr>
+            </w:pPr>
+            <w:r>
+              <w:rPr>
+                <w:rFonts w:ascii="Arial" w:hAnsi="Arial" w:cs="Arial"/>
+                <w:color w:val="000000"/>
+                <w:sz w:val="17"/>
+                <w:szCs w:val="17"/>
+              </w:rPr>
+              <w:t>Variável de atividade usada no cálculo de emissões e na amostra exibida no dashboard</w:t>
             </w:r>
           </w:p>
         </w:tc>
@@ -920,51 +1013,82 @@
         </w:tblPrEx>
         <w:tc>
           <w:tcPr>
-            <w:tcW w:w="1600" w:type="dxa"/>
-            <w:tcMar>
-              <w:top w:w="80" w:type="dxa"/>
-              <w:left w:w="100" w:type="dxa"/>
-              <w:bottom w:w="80" w:type="dxa"/>
-              <w:right w:w="100" w:type="dxa"/>
-            </w:tcMar>
-          </w:tcPr>
-          <w:p>
-            <w:pPr>
-              <w:rPr>
-                <w:rFonts w:ascii="Arial" w:hAnsi="Arial" w:cs="Arial"/>
-              </w:rPr>
-            </w:pPr>
-            <w:r>
-              <w:rPr>
-                <w:rFonts w:ascii="Arial" w:hAnsi="Arial" w:cs="Arial"/>
-                <w:color w:val="000000"/>
-              </w:rPr>
-              <w:t>Dados de calendário/contexto</w:t>
-            </w:r>
-          </w:p>
-        </w:tc>
-        <w:tc>
-          <w:tcPr>
-            <w:tcW w:w="1600" w:type="dxa"/>
-            <w:tcMar>
-              <w:top w:w="80" w:type="dxa"/>
-              <w:left w:w="100" w:type="dxa"/>
-              <w:bottom w:w="80" w:type="dxa"/>
-              <w:right w:w="100" w:type="dxa"/>
-            </w:tcMar>
-          </w:tcPr>
-          <w:p>
-            <w:pPr>
-              <w:rPr>
-                <w:rFonts w:ascii="Arial" w:hAnsi="Arial" w:cs="Arial"/>
-              </w:rPr>
-            </w:pPr>
-            <w:r>
-              <w:rPr>
-                <w:rFonts w:ascii="Arial" w:hAnsi="Arial" w:cs="Arial"/>
-                <w:color w:val="000000"/>
-              </w:rPr>
-              <w:t>Datas, feriados, sazonalidade</w:t>
+            <w:tcW w:w="1450" w:type="dxa"/>
+            <w:tcMar>
+              <w:top w:w="80" w:type="dxa"/>
+              <w:left w:w="100" w:type="dxa"/>
+              <w:bottom w:w="80" w:type="dxa"/>
+              <w:right w:w="100" w:type="dxa"/>
+            </w:tcMar>
+          </w:tcPr>
+          <w:p>
+            <w:pPr>
+              <w:rPr>
+                <w:rFonts w:ascii="Arial" w:hAnsi="Arial" w:cs="Arial"/>
+              </w:rPr>
+            </w:pPr>
+            <w:r>
+              <w:rPr>
+                <w:rFonts w:ascii="Arial" w:hAnsi="Arial" w:cs="Arial"/>
+                <w:color w:val="000000"/>
+                <w:sz w:val="17"/>
+                <w:szCs w:val="17"/>
+              </w:rPr>
+              <w:t>eCycle — páginas ODS 12 e ODS 13 (NOVA)</w:t>
+            </w:r>
+          </w:p>
+        </w:tc>
+        <w:tc>
+          <w:tcPr>
+            <w:tcW w:w="1450" w:type="dxa"/>
+            <w:tcMar>
+              <w:top w:w="80" w:type="dxa"/>
+              <w:left w:w="100" w:type="dxa"/>
+              <w:bottom w:w="80" w:type="dxa"/>
+              <w:right w:w="100" w:type="dxa"/>
+            </w:tcMar>
+          </w:tcPr>
+          <w:p>
+            <w:pPr>
+              <w:rPr>
+                <w:rFonts w:ascii="Arial" w:hAnsi="Arial" w:cs="Arial"/>
+              </w:rPr>
+            </w:pPr>
+            <w:r>
+              <w:rPr>
+                <w:rFonts w:ascii="Arial" w:hAnsi="Arial" w:cs="Arial"/>
+                <w:color w:val="000000"/>
+                <w:sz w:val="17"/>
+                <w:szCs w:val="17"/>
+              </w:rPr>
+              <w:t>Texto institucional sobre os ODS 12 e 13 (metas, contexto)</w:t>
+            </w:r>
+          </w:p>
+        </w:tc>
+        <w:tc>
+          <w:tcPr>
+            <w:tcW w:w="1250" w:type="dxa"/>
+            <w:tcMar>
+              <w:top w:w="80" w:type="dxa"/>
+              <w:left w:w="100" w:type="dxa"/>
+              <w:bottom w:w="80" w:type="dxa"/>
+              <w:right w:w="100" w:type="dxa"/>
+            </w:tcMar>
+          </w:tcPr>
+          <w:p>
+            <w:pPr>
+              <w:rPr>
+                <w:rFonts w:ascii="Arial" w:hAnsi="Arial" w:cs="Arial"/>
+              </w:rPr>
+            </w:pPr>
+            <w:r>
+              <w:rPr>
+                <w:rFonts w:ascii="Arial" w:hAnsi="Arial" w:cs="Arial"/>
+                <w:color w:val="000000"/>
+                <w:sz w:val="17"/>
+                <w:szCs w:val="17"/>
+              </w:rPr>
+              <w:t>Web scraping (BeautifulSoup + requests)</w:t>
             </w:r>
           </w:p>
         </w:tc>
@@ -988,58 +1112,404 @@
               <w:rPr>
                 <w:rFonts w:ascii="Arial" w:hAnsi="Arial" w:cs="Arial"/>
                 <w:color w:val="000000"/>
-              </w:rPr>
-              <w:t>Gerado em Python (biblioteca de calendário)</w:t>
-            </w:r>
-          </w:p>
-        </w:tc>
-        <w:tc>
-          <w:tcPr>
-            <w:tcW w:w="1400" w:type="dxa"/>
-            <w:tcMar>
-              <w:top w:w="80" w:type="dxa"/>
-              <w:left w:w="100" w:type="dxa"/>
-              <w:bottom w:w="80" w:type="dxa"/>
-              <w:right w:w="100" w:type="dxa"/>
-            </w:tcMar>
-          </w:tcPr>
-          <w:p>
-            <w:pPr>
-              <w:rPr>
-                <w:rFonts w:ascii="Arial" w:hAnsi="Arial" w:cs="Arial"/>
-              </w:rPr>
-            </w:pPr>
-            <w:r>
-              <w:rPr>
-                <w:rFonts w:ascii="Arial" w:hAnsi="Arial" w:cs="Arial"/>
-                <w:color w:val="000000"/>
-              </w:rPr>
-              <w:t>Estático</w:t>
-            </w:r>
-          </w:p>
-        </w:tc>
-        <w:tc>
-          <w:tcPr>
-            <w:tcW w:w="3450" w:type="dxa"/>
-            <w:tcMar>
-              <w:top w:w="80" w:type="dxa"/>
-              <w:left w:w="100" w:type="dxa"/>
-              <w:bottom w:w="80" w:type="dxa"/>
-              <w:right w:w="100" w:type="dxa"/>
-            </w:tcMar>
-          </w:tcPr>
-          <w:p>
-            <w:pPr>
-              <w:rPr>
-                <w:rFonts w:ascii="Arial" w:hAnsi="Arial" w:cs="Arial"/>
-              </w:rPr>
-            </w:pPr>
-            <w:r>
-              <w:rPr>
-                <w:rFonts w:ascii="Arial" w:hAnsi="Arial" w:cs="Arial"/>
-                <w:color w:val="000000"/>
-              </w:rPr>
-              <w:t>Enriquecer o modelo de série temporal com variáveis sazonais (ex.: maior consumo de energia em períodos específicos)</w:t>
+                <w:sz w:val="17"/>
+                <w:szCs w:val="17"/>
+              </w:rPr>
+              <w:t>Sob demanda (execução do script)</w:t>
+            </w:r>
+          </w:p>
+        </w:tc>
+        <w:tc>
+          <w:tcPr>
+            <w:tcW w:w="1300" w:type="dxa"/>
+            <w:tcMar>
+              <w:top w:w="80" w:type="dxa"/>
+              <w:left w:w="100" w:type="dxa"/>
+              <w:bottom w:w="80" w:type="dxa"/>
+              <w:right w:w="100" w:type="dxa"/>
+            </w:tcMar>
+          </w:tcPr>
+          <w:p>
+            <w:pPr>
+              <w:rPr>
+                <w:rFonts w:ascii="Arial" w:hAnsi="Arial" w:cs="Arial"/>
+              </w:rPr>
+            </w:pPr>
+            <w:r>
+              <w:rPr>
+                <w:rFonts w:ascii="Arial" w:hAnsi="Arial" w:cs="Arial"/>
+                <w:color w:val="000000"/>
+                <w:sz w:val="17"/>
+                <w:szCs w:val="17"/>
+              </w:rPr>
+              <w:t>Sim — via urllib.robotparser antes da coleta</w:t>
+            </w:r>
+          </w:p>
+        </w:tc>
+        <w:tc>
+          <w:tcPr>
+            <w:tcW w:w="2600" w:type="dxa"/>
+            <w:tcMar>
+              <w:top w:w="80" w:type="dxa"/>
+              <w:left w:w="100" w:type="dxa"/>
+              <w:bottom w:w="80" w:type="dxa"/>
+              <w:right w:w="100" w:type="dxa"/>
+            </w:tcMar>
+          </w:tcPr>
+          <w:p>
+            <w:pPr>
+              <w:rPr>
+                <w:rFonts w:ascii="Arial" w:hAnsi="Arial" w:cs="Arial"/>
+              </w:rPr>
+            </w:pPr>
+            <w:r>
+              <w:rPr>
+                <w:rFonts w:ascii="Arial" w:hAnsi="Arial" w:cs="Arial"/>
+                <w:color w:val="000000"/>
+                <w:sz w:val="17"/>
+                <w:szCs w:val="17"/>
+              </w:rPr>
+              <w:t>Alimentar a nuvem de palavras e as estatísticas básicas de contexto sobre os ODS na aplicação</w:t>
+            </w:r>
+          </w:p>
+        </w:tc>
+      </w:tr>
+      <w:tr>
+        <w:tblPrEx>
+          <w:tblCellMar>
+            <w:top w:w="0" w:type="dxa"/>
+            <w:bottom w:w="0" w:type="dxa"/>
+          </w:tblCellMar>
+        </w:tblPrEx>
+        <w:tc>
+          <w:tcPr>
+            <w:tcW w:w="1450" w:type="dxa"/>
+            <w:tcMar>
+              <w:top w:w="80" w:type="dxa"/>
+              <w:left w:w="100" w:type="dxa"/>
+              <w:bottom w:w="80" w:type="dxa"/>
+              <w:right w:w="100" w:type="dxa"/>
+            </w:tcMar>
+          </w:tcPr>
+          <w:p>
+            <w:pPr>
+              <w:rPr>
+                <w:rFonts w:ascii="Arial" w:hAnsi="Arial" w:cs="Arial"/>
+              </w:rPr>
+            </w:pPr>
+            <w:r>
+              <w:rPr>
+                <w:rFonts w:ascii="Arial" w:hAnsi="Arial" w:cs="Arial"/>
+                <w:color w:val="000000"/>
+                <w:sz w:val="17"/>
+                <w:szCs w:val="17"/>
+              </w:rPr>
+              <w:t>Exame ESG — manchetes de notícias (NOVA)</w:t>
+            </w:r>
+          </w:p>
+        </w:tc>
+        <w:tc>
+          <w:tcPr>
+            <w:tcW w:w="1450" w:type="dxa"/>
+            <w:tcMar>
+              <w:top w:w="80" w:type="dxa"/>
+              <w:left w:w="100" w:type="dxa"/>
+              <w:bottom w:w="80" w:type="dxa"/>
+              <w:right w:w="100" w:type="dxa"/>
+            </w:tcMar>
+          </w:tcPr>
+          <w:p>
+            <w:pPr>
+              <w:rPr>
+                <w:rFonts w:ascii="Arial" w:hAnsi="Arial" w:cs="Arial"/>
+              </w:rPr>
+            </w:pPr>
+            <w:r>
+              <w:rPr>
+                <w:rFonts w:ascii="Arial" w:hAnsi="Arial" w:cs="Arial"/>
+                <w:color w:val="000000"/>
+                <w:sz w:val="17"/>
+                <w:szCs w:val="17"/>
+              </w:rPr>
+              <w:t>Título, data e link de notícias sobre ESG/pegada de carbono</w:t>
+            </w:r>
+          </w:p>
+        </w:tc>
+        <w:tc>
+          <w:tcPr>
+            <w:tcW w:w="1250" w:type="dxa"/>
+            <w:tcMar>
+              <w:top w:w="80" w:type="dxa"/>
+              <w:left w:w="100" w:type="dxa"/>
+              <w:bottom w:w="80" w:type="dxa"/>
+              <w:right w:w="100" w:type="dxa"/>
+            </w:tcMar>
+          </w:tcPr>
+          <w:p>
+            <w:pPr>
+              <w:rPr>
+                <w:rFonts w:ascii="Arial" w:hAnsi="Arial" w:cs="Arial"/>
+              </w:rPr>
+            </w:pPr>
+            <w:r>
+              <w:rPr>
+                <w:rFonts w:ascii="Arial" w:hAnsi="Arial" w:cs="Arial"/>
+                <w:color w:val="000000"/>
+                <w:sz w:val="17"/>
+                <w:szCs w:val="17"/>
+              </w:rPr>
+              <w:t>Web scraping (BeautifulSoup + requests)</w:t>
+            </w:r>
+          </w:p>
+        </w:tc>
+        <w:tc>
+          <w:tcPr>
+            <w:tcW w:w="1300" w:type="dxa"/>
+            <w:tcMar>
+              <w:top w:w="80" w:type="dxa"/>
+              <w:left w:w="100" w:type="dxa"/>
+              <w:bottom w:w="80" w:type="dxa"/>
+              <w:right w:w="100" w:type="dxa"/>
+            </w:tcMar>
+          </w:tcPr>
+          <w:p>
+            <w:pPr>
+              <w:rPr>
+                <w:rFonts w:ascii="Arial" w:hAnsi="Arial" w:cs="Arial"/>
+              </w:rPr>
+            </w:pPr>
+            <w:r>
+              <w:rPr>
+                <w:rFonts w:ascii="Arial" w:hAnsi="Arial" w:cs="Arial"/>
+                <w:color w:val="000000"/>
+                <w:sz w:val="17"/>
+                <w:szCs w:val="17"/>
+              </w:rPr>
+              <w:t>Sob demanda (execução do script)</w:t>
+            </w:r>
+          </w:p>
+        </w:tc>
+        <w:tc>
+          <w:tcPr>
+            <w:tcW w:w="1300" w:type="dxa"/>
+            <w:tcMar>
+              <w:top w:w="80" w:type="dxa"/>
+              <w:left w:w="100" w:type="dxa"/>
+              <w:bottom w:w="80" w:type="dxa"/>
+              <w:right w:w="100" w:type="dxa"/>
+            </w:tcMar>
+          </w:tcPr>
+          <w:p>
+            <w:pPr>
+              <w:rPr>
+                <w:rFonts w:ascii="Arial" w:hAnsi="Arial" w:cs="Arial"/>
+              </w:rPr>
+            </w:pPr>
+            <w:r>
+              <w:rPr>
+                <w:rFonts w:ascii="Arial" w:hAnsi="Arial" w:cs="Arial"/>
+                <w:color w:val="000000"/>
+                <w:sz w:val="17"/>
+                <w:szCs w:val="17"/>
+              </w:rPr>
+              <w:t>Sim — via urllib.robotparser antes da coleta</w:t>
+            </w:r>
+          </w:p>
+        </w:tc>
+        <w:tc>
+          <w:tcPr>
+            <w:tcW w:w="2600" w:type="dxa"/>
+            <w:tcMar>
+              <w:top w:w="80" w:type="dxa"/>
+              <w:left w:w="100" w:type="dxa"/>
+              <w:bottom w:w="80" w:type="dxa"/>
+              <w:right w:w="100" w:type="dxa"/>
+            </w:tcMar>
+          </w:tcPr>
+          <w:p>
+            <w:pPr>
+              <w:rPr>
+                <w:rFonts w:ascii="Arial" w:hAnsi="Arial" w:cs="Arial"/>
+              </w:rPr>
+            </w:pPr>
+            <w:r>
+              <w:rPr>
+                <w:rFonts w:ascii="Arial" w:hAnsi="Arial" w:cs="Arial"/>
+                <w:color w:val="000000"/>
+                <w:sz w:val="17"/>
+                <w:szCs w:val="17"/>
+              </w:rPr>
+              <w:t>Alimentar a tabela de notícias e a nuvem de palavras na aba 'Notícias' da aplicação</w:t>
+            </w:r>
+          </w:p>
+        </w:tc>
+      </w:tr>
+      <w:tr>
+        <w:tblPrEx>
+          <w:tblCellMar>
+            <w:top w:w="0" w:type="dxa"/>
+            <w:bottom w:w="0" w:type="dxa"/>
+          </w:tblCellMar>
+        </w:tblPrEx>
+        <w:tc>
+          <w:tcPr>
+            <w:tcW w:w="1450" w:type="dxa"/>
+            <w:tcMar>
+              <w:top w:w="80" w:type="dxa"/>
+              <w:left w:w="100" w:type="dxa"/>
+              <w:bottom w:w="80" w:type="dxa"/>
+              <w:right w:w="100" w:type="dxa"/>
+            </w:tcMar>
+          </w:tcPr>
+          <w:p>
+            <w:pPr>
+              <w:rPr>
+                <w:rFonts w:ascii="Arial" w:hAnsi="Arial" w:cs="Arial"/>
+              </w:rPr>
+            </w:pPr>
+            <w:r>
+              <w:rPr>
+                <w:rFonts w:ascii="Arial" w:hAnsi="Arial" w:cs="Arial"/>
+                <w:color w:val="000000"/>
+                <w:sz w:val="17"/>
+                <w:szCs w:val="17"/>
+              </w:rPr>
+              <w:t>Upload de CSV pelo usuário (NOVA)</w:t>
+            </w:r>
+          </w:p>
+        </w:tc>
+        <w:tc>
+          <w:tcPr>
+            <w:tcW w:w="1450" w:type="dxa"/>
+            <w:tcMar>
+              <w:top w:w="80" w:type="dxa"/>
+              <w:left w:w="100" w:type="dxa"/>
+              <w:bottom w:w="80" w:type="dxa"/>
+              <w:right w:w="100" w:type="dxa"/>
+            </w:tcMar>
+          </w:tcPr>
+          <w:p>
+            <w:pPr>
+              <w:rPr>
+                <w:rFonts w:ascii="Arial" w:hAnsi="Arial" w:cs="Arial"/>
+              </w:rPr>
+            </w:pPr>
+            <w:r>
+              <w:rPr>
+                <w:rFonts w:ascii="Arial" w:hAnsi="Arial" w:cs="Arial"/>
+                <w:color w:val="000000"/>
+                <w:sz w:val="17"/>
+                <w:szCs w:val="17"/>
+              </w:rPr>
+              <w:t>Dados de atividade/emissão no mesmo schema da amostra processada</w:t>
+            </w:r>
+          </w:p>
+        </w:tc>
+        <w:tc>
+          <w:tcPr>
+            <w:tcW w:w="1250" w:type="dxa"/>
+            <w:tcMar>
+              <w:top w:w="80" w:type="dxa"/>
+              <w:left w:w="100" w:type="dxa"/>
+              <w:bottom w:w="80" w:type="dxa"/>
+              <w:right w:w="100" w:type="dxa"/>
+            </w:tcMar>
+          </w:tcPr>
+          <w:p>
+            <w:pPr>
+              <w:rPr>
+                <w:rFonts w:ascii="Arial" w:hAnsi="Arial" w:cs="Arial"/>
+              </w:rPr>
+            </w:pPr>
+            <w:r>
+              <w:rPr>
+                <w:rFonts w:ascii="Arial" w:hAnsi="Arial" w:cs="Arial"/>
+                <w:color w:val="000000"/>
+                <w:sz w:val="17"/>
+                <w:szCs w:val="17"/>
+              </w:rPr>
+              <w:t>CSV enviado via st.file_uploader</w:t>
+            </w:r>
+          </w:p>
+        </w:tc>
+        <w:tc>
+          <w:tcPr>
+            <w:tcW w:w="1300" w:type="dxa"/>
+            <w:tcMar>
+              <w:top w:w="80" w:type="dxa"/>
+              <w:left w:w="100" w:type="dxa"/>
+              <w:bottom w:w="80" w:type="dxa"/>
+              <w:right w:w="100" w:type="dxa"/>
+            </w:tcMar>
+          </w:tcPr>
+          <w:p>
+            <w:pPr>
+              <w:rPr>
+                <w:rFonts w:ascii="Arial" w:hAnsi="Arial" w:cs="Arial"/>
+              </w:rPr>
+            </w:pPr>
+            <w:r>
+              <w:rPr>
+                <w:rFonts w:ascii="Arial" w:hAnsi="Arial" w:cs="Arial"/>
+                <w:color w:val="000000"/>
+                <w:sz w:val="17"/>
+                <w:szCs w:val="17"/>
+              </w:rPr>
+              <w:t>Sob demanda (a cada upload)</w:t>
+            </w:r>
+          </w:p>
+        </w:tc>
+        <w:tc>
+          <w:tcPr>
+            <w:tcW w:w="1300" w:type="dxa"/>
+            <w:tcMar>
+              <w:top w:w="80" w:type="dxa"/>
+              <w:left w:w="100" w:type="dxa"/>
+              <w:bottom w:w="80" w:type="dxa"/>
+              <w:right w:w="100" w:type="dxa"/>
+            </w:tcMar>
+          </w:tcPr>
+          <w:p>
+            <w:pPr>
+              <w:rPr>
+                <w:rFonts w:ascii="Arial" w:hAnsi="Arial" w:cs="Arial"/>
+              </w:rPr>
+            </w:pPr>
+            <w:r>
+              <w:rPr>
+                <w:rFonts w:ascii="Arial" w:hAnsi="Arial" w:cs="Arial"/>
+                <w:color w:val="000000"/>
+                <w:sz w:val="17"/>
+                <w:szCs w:val="17"/>
+              </w:rPr>
+              <w:t>N/A (dado fornecido pelo próprio usuário)</w:t>
+            </w:r>
+          </w:p>
+        </w:tc>
+        <w:tc>
+          <w:tcPr>
+            <w:tcW w:w="2600" w:type="dxa"/>
+            <w:tcMar>
+              <w:top w:w="80" w:type="dxa"/>
+              <w:left w:w="100" w:type="dxa"/>
+              <w:bottom w:w="80" w:type="dxa"/>
+              <w:right w:w="100" w:type="dxa"/>
+            </w:tcMar>
+          </w:tcPr>
+          <w:p>
+            <w:pPr>
+              <w:rPr>
+                <w:rFonts w:ascii="Arial" w:hAnsi="Arial" w:cs="Arial"/>
+              </w:rPr>
+            </w:pPr>
+            <w:r>
+              <w:rPr>
+                <w:rFonts w:ascii="Arial" w:hAnsi="Arial" w:cs="Arial"/>
+                <w:color w:val="000000"/>
+                <w:sz w:val="17"/>
+                <w:szCs w:val="17"/>
+              </w:rPr>
+              <w:t>Complementar/enriquecer o dataset exibido no dashboard com dados reais da organização</w:t>
             </w:r>
           </w:p>
         </w:tc>
@@ -1065,8 +1535,19 @@
         <w:rPr>
           <w:rFonts w:ascii="Arial" w:hAnsi="Arial" w:cs="Arial"/>
         </w:rPr>
-        <w:lastRenderedPageBreak/>
-        <w:t>3. Detalhamento por Fonte</w:t>
+        <w:t>3. Detalhamento das Novas Fontes (</w:t>
+      </w:r>
+      <w:r>
+        <w:rPr>
+          <w:rFonts w:ascii="Arial" w:hAnsi="Arial" w:cs="Arial"/>
+        </w:rPr>
+        <w:t>Versão</w:t>
+      </w:r>
+      <w:r>
+        <w:rPr>
+          <w:rFonts w:ascii="Arial" w:hAnsi="Arial" w:cs="Arial"/>
+        </w:rPr>
+        <w:t xml:space="preserve"> 2)</w:t>
       </w:r>
     </w:p>
     <w:p>
@@ -1081,21 +1562,7 @@
         <w:rPr>
           <w:rFonts w:ascii="Arial" w:hAnsi="Arial" w:cs="Arial"/>
         </w:rPr>
-        <w:t xml:space="preserve">3.1 </w:t>
-      </w:r>
-      <w:proofErr w:type="spellStart"/>
-      <w:r>
-        <w:rPr>
-          <w:rFonts w:ascii="Arial" w:hAnsi="Arial" w:cs="Arial"/>
-        </w:rPr>
-        <w:t>Climatiq</w:t>
-      </w:r>
-      <w:proofErr w:type="spellEnd"/>
-      <w:r>
-        <w:rPr>
-          <w:rFonts w:ascii="Arial" w:hAnsi="Arial" w:cs="Arial"/>
-        </w:rPr>
-        <w:t xml:space="preserve"> API</w:t>
+        <w:t>3.1 eCycle — conteúdo sobre ODS 12 e ODS 13</w:t>
       </w:r>
     </w:p>
     <w:p>
@@ -1114,7 +1581,7 @@
         <w:rPr>
           <w:rFonts w:ascii="Arial" w:hAnsi="Arial" w:cs="Arial"/>
         </w:rPr>
-        <w:t>Descrição: API especializada em fatores de emissão, cobrindo eletricidade, combustíveis, transporte e outras categorias de atividade.</w:t>
+        <w:t>Descrição: portal de conteúdo ambiental brasileiro; as páginas específicas sobre os ODS 12 e 13 explicam metas oficiais da Agenda 2030 em português.</w:t>
       </w:r>
     </w:p>
     <w:p>
@@ -1133,35 +1600,7 @@
         <w:rPr>
           <w:rFonts w:ascii="Arial" w:hAnsi="Arial" w:cs="Arial"/>
         </w:rPr>
-        <w:t>Acesso: chave de API (</w:t>
-      </w:r>
-      <w:proofErr w:type="spellStart"/>
-      <w:r>
-        <w:rPr>
-          <w:rFonts w:ascii="Arial" w:hAnsi="Arial" w:cs="Arial"/>
-        </w:rPr>
-        <w:t>free</w:t>
-      </w:r>
-      <w:proofErr w:type="spellEnd"/>
-      <w:r>
-        <w:rPr>
-          <w:rFonts w:ascii="Arial" w:hAnsi="Arial" w:cs="Arial"/>
-        </w:rPr>
-        <w:t xml:space="preserve"> </w:t>
-      </w:r>
-      <w:proofErr w:type="spellStart"/>
-      <w:r>
-        <w:rPr>
-          <w:rFonts w:ascii="Arial" w:hAnsi="Arial" w:cs="Arial"/>
-        </w:rPr>
-        <w:t>tier</w:t>
-      </w:r>
-      <w:proofErr w:type="spellEnd"/>
-      <w:r>
-        <w:rPr>
-          <w:rFonts w:ascii="Arial" w:hAnsi="Arial" w:cs="Arial"/>
-        </w:rPr>
-        <w:t xml:space="preserve"> com limite de requisições); autenticação via header HTTP.</w:t>
+        <w:t>Verificação de robots.txt: realizada em tempo de execução pelo script scrape_ods_ecycle.py, por meio de urllib.robotparser, antes de qualquer requisição de conteúdo.</w:t>
       </w:r>
     </w:p>
     <w:p>
@@ -1180,7 +1619,8 @@
         <w:rPr>
           <w:rFonts w:ascii="Arial" w:hAnsi="Arial" w:cs="Arial"/>
         </w:rPr>
-        <w:t>Uso planejado: chamada programática a partir dos dados de consumo simulados, retornando o fator de emissão correspondente para cálculo de kg CO2e.</w:t>
+        <w:lastRenderedPageBreak/>
+        <w:t>Coleta: título da página e parágrafos do corpo do artigo (BeautifulSoup), com filtro de tamanho mínimo para evitar capturar menus/rodapés.</w:t>
       </w:r>
     </w:p>
     <w:p>
@@ -1199,46 +1639,7 @@
         <w:rPr>
           <w:rFonts w:ascii="Arial" w:hAnsi="Arial" w:cs="Arial"/>
         </w:rPr>
-        <w:t xml:space="preserve">Riscos: rate </w:t>
-      </w:r>
-      <w:proofErr w:type="spellStart"/>
-      <w:r>
-        <w:rPr>
-          <w:rFonts w:ascii="Arial" w:hAnsi="Arial" w:cs="Arial"/>
-        </w:rPr>
-        <w:t>limiting</w:t>
-      </w:r>
-      <w:proofErr w:type="spellEnd"/>
-      <w:r>
-        <w:rPr>
-          <w:rFonts w:ascii="Arial" w:hAnsi="Arial" w:cs="Arial"/>
-        </w:rPr>
-        <w:t>; necessidade de cache local para evitar chamadas repetidas.</w:t>
-      </w:r>
-    </w:p>
-    <w:p>
-      <w:pPr>
-        <w:pStyle w:val="PargrafodaLista"/>
-        <w:spacing w:after="60"/>
-        <w:ind w:left="720"/>
-        <w:rPr>
-          <w:rFonts w:ascii="Arial" w:hAnsi="Arial" w:cs="Arial"/>
-        </w:rPr>
-      </w:pPr>
-    </w:p>
-    <w:p>
-      <w:pPr>
-        <w:pStyle w:val="Ttulo2"/>
-        <w:spacing w:before="250" w:after="120"/>
-        <w:rPr>
-          <w:rFonts w:ascii="Arial" w:hAnsi="Arial" w:cs="Arial"/>
-        </w:rPr>
-      </w:pPr>
-      <w:r>
-        <w:rPr>
-          <w:rFonts w:ascii="Arial" w:hAnsi="Arial" w:cs="Arial"/>
-        </w:rPr>
-        <w:t>3.2 SEEG / Observatório do Clima</w:t>
+        <w:t>Uso planejado: corpus de texto para geração de nuvem de palavras e estatísticas de frequência de termos na aplicação.</w:t>
       </w:r>
     </w:p>
     <w:p>
@@ -1257,7 +1658,22 @@
         <w:rPr>
           <w:rFonts w:ascii="Arial" w:hAnsi="Arial" w:cs="Arial"/>
         </w:rPr>
-        <w:t>Descrição: iniciativa brasileira que disponibiliza estimativas de emissões de gases de efeito estufa por setor econômico.</w:t>
+        <w:t>Cuidado com direitos autorais: apenas trechos curtos e pontuais são armazenados, sem reprodução integral dos artigos.</w:t>
+      </w:r>
+    </w:p>
+    <w:p>
+      <w:pPr>
+        <w:pStyle w:val="Ttulo2"/>
+        <w:spacing w:before="250" w:after="120"/>
+        <w:rPr>
+          <w:rFonts w:ascii="Arial" w:hAnsi="Arial" w:cs="Arial"/>
+        </w:rPr>
+      </w:pPr>
+      <w:r>
+        <w:rPr>
+          <w:rFonts w:ascii="Arial" w:hAnsi="Arial" w:cs="Arial"/>
+        </w:rPr>
+        <w:t>3.2 Exame ESG — manchetes de notícias</w:t>
       </w:r>
     </w:p>
     <w:p>
@@ -1276,7 +1692,7 @@
         <w:rPr>
           <w:rFonts w:ascii="Arial" w:hAnsi="Arial" w:cs="Arial"/>
         </w:rPr>
-        <w:t>Acesso: dados abertos, download direto (sem necessidade de autenticação).</w:t>
+        <w:t>Descrição: seção de ESG do portal Exame, com notícias frequentes sobre pegada de carbono, sustentabilidade corporativa e regulação ambiental.</w:t>
       </w:r>
     </w:p>
     <w:p>
@@ -1295,7 +1711,7 @@
         <w:rPr>
           <w:rFonts w:ascii="Arial" w:hAnsi="Arial" w:cs="Arial"/>
         </w:rPr>
-        <w:t>Uso planejado: comparação e validação de plausibilidade dos números simulados/calculados no projeto (benchmark externo).</w:t>
+        <w:t>Verificação de robots.txt: realizada em tempo de execução pelo script scrape_noticias_esg.py, também via urllib.robotparser.</w:t>
       </w:r>
     </w:p>
     <w:p>
@@ -1314,32 +1730,7 @@
         <w:rPr>
           <w:rFonts w:ascii="Arial" w:hAnsi="Arial" w:cs="Arial"/>
         </w:rPr>
-        <w:t>Riscos: granularidade setorial/nacional, não específica por empresa — uso limitado a contextualização.</w:t>
-      </w:r>
-    </w:p>
-    <w:p>
-      <w:pPr>
-        <w:pStyle w:val="PargrafodaLista"/>
-        <w:spacing w:after="60"/>
-        <w:ind w:left="720"/>
-        <w:rPr>
-          <w:rFonts w:ascii="Arial" w:hAnsi="Arial" w:cs="Arial"/>
-        </w:rPr>
-      </w:pPr>
-    </w:p>
-    <w:p>
-      <w:pPr>
-        <w:pStyle w:val="Ttulo2"/>
-        <w:spacing w:before="250" w:after="120"/>
-        <w:rPr>
-          <w:rFonts w:ascii="Arial" w:hAnsi="Arial" w:cs="Arial"/>
-        </w:rPr>
-      </w:pPr>
-      <w:r>
-        <w:rPr>
-          <w:rFonts w:ascii="Arial" w:hAnsi="Arial" w:cs="Arial"/>
-        </w:rPr>
-        <w:t>3.3 EPA / DEFRA</w:t>
+        <w:t>Coleta: apenas metadados públicos já exibidos na página de listagem (título, link) — sem reprodução do corpo das matérias, preservando os direitos autorais do veículo.</w:t>
       </w:r>
     </w:p>
     <w:p>
@@ -1358,7 +1749,22 @@
         <w:rPr>
           <w:rFonts w:ascii="Arial" w:hAnsi="Arial" w:cs="Arial"/>
         </w:rPr>
-        <w:t>Descrição: bases de fatores de emissão publicadas por agências ambientais dos EUA e Reino Unido, amplamente utilizadas como padrão internacional.</w:t>
+        <w:t>Uso planejado: tabela de notícias na aplicação e corpus de títulos para a nuvem de palavras.</w:t>
+      </w:r>
+    </w:p>
+    <w:p>
+      <w:pPr>
+        <w:pStyle w:val="Ttulo2"/>
+        <w:spacing w:before="250" w:after="120"/>
+        <w:rPr>
+          <w:rFonts w:ascii="Arial" w:hAnsi="Arial" w:cs="Arial"/>
+        </w:rPr>
+      </w:pPr>
+      <w:r>
+        <w:rPr>
+          <w:rFonts w:ascii="Arial" w:hAnsi="Arial" w:cs="Arial"/>
+        </w:rPr>
+        <w:t>3.3 Upload de CSV pelo usuário</w:t>
       </w:r>
     </w:p>
     <w:p>
@@ -1377,7 +1783,7 @@
         <w:rPr>
           <w:rFonts w:ascii="Arial" w:hAnsi="Arial" w:cs="Arial"/>
         </w:rPr>
-        <w:t>Acesso: planilhas públicas para download.</w:t>
+        <w:t>Descrição: mecanismo para que o usuário complemente a base de dados exibida com informações reais da sua organização, via st.file_uploader.</w:t>
       </w:r>
     </w:p>
     <w:p>
@@ -1396,7 +1802,7 @@
         <w:rPr>
           <w:rFonts w:ascii="Arial" w:hAnsi="Arial" w:cs="Arial"/>
         </w:rPr>
-        <w:t>Uso planejado: fonte alternativa de fatores de emissão para checagem cruzada e para cenários que exijam padrão internacional (ex.: relatórios CDP).</w:t>
+        <w:t>Validação: o schema do arquivo enviado é conferido antes da mesclagem (colunas obrigatórias: mes_referencia, unidade, setor, tipo_atividade, quantidade, unidade_medida, fator_emissao_kgco2e, emissao_kgco2e, fonte_fator).</w:t>
       </w:r>
     </w:p>
     <w:p>
@@ -1415,46 +1821,22 @@
         <w:rPr>
           <w:rFonts w:ascii="Arial" w:hAnsi="Arial" w:cs="Arial"/>
         </w:rPr>
-        <w:t xml:space="preserve">Riscos: unidades e categorias podem divergir da </w:t>
-      </w:r>
-      <w:proofErr w:type="spellStart"/>
-      <w:r>
-        <w:rPr>
-          <w:rFonts w:ascii="Arial" w:hAnsi="Arial" w:cs="Arial"/>
-        </w:rPr>
-        <w:t>Climatiq</w:t>
-      </w:r>
-      <w:proofErr w:type="spellEnd"/>
-      <w:r>
-        <w:rPr>
-          <w:rFonts w:ascii="Arial" w:hAnsi="Arial" w:cs="Arial"/>
-        </w:rPr>
-        <w:t xml:space="preserve"> API, exigindo padronização antes do uso conjunto.</w:t>
-      </w:r>
-    </w:p>
-    <w:p>
-      <w:pPr>
-        <w:pStyle w:val="PargrafodaLista"/>
-        <w:spacing w:after="60"/>
-        <w:ind w:left="720"/>
-        <w:rPr>
-          <w:rFonts w:ascii="Arial" w:hAnsi="Arial" w:cs="Arial"/>
-        </w:rPr>
-      </w:pPr>
-    </w:p>
-    <w:p>
-      <w:pPr>
-        <w:pStyle w:val="Ttulo2"/>
-        <w:spacing w:before="250" w:after="120"/>
-        <w:rPr>
-          <w:rFonts w:ascii="Arial" w:hAnsi="Arial" w:cs="Arial"/>
-        </w:rPr>
-      </w:pPr>
-      <w:r>
-        <w:rPr>
-          <w:rFonts w:ascii="Arial" w:hAnsi="Arial" w:cs="Arial"/>
-        </w:rPr>
-        <w:t>3.4 Dados internos simulados</w:t>
+        <w:t>Persistência: os dados mesclados ficam disponíveis durante a sessão do usuário (st.session_state) e podem ser exportados via botão de download.</w:t>
+      </w:r>
+    </w:p>
+    <w:p>
+      <w:pPr>
+        <w:pStyle w:val="Ttulo1"/>
+        <w:spacing w:before="300" w:after="150"/>
+        <w:rPr>
+          <w:rFonts w:ascii="Arial" w:hAnsi="Arial" w:cs="Arial"/>
+        </w:rPr>
+      </w:pPr>
+      <w:r>
+        <w:rPr>
+          <w:rFonts w:ascii="Arial" w:hAnsi="Arial" w:cs="Arial"/>
+        </w:rPr>
+        <w:t>4. Considerações de Qualidade e Conformidade dos Dados</w:t>
       </w:r>
     </w:p>
     <w:p>
@@ -1473,7 +1855,7 @@
         <w:rPr>
           <w:rFonts w:ascii="Arial" w:hAnsi="Arial" w:cs="Arial"/>
         </w:rPr>
-        <w:t>Descrição: como o projeto não tem acesso a dados reais de uma empresa, será construído um gerador sintético de dados operacionais (consumo de energia, frota, insumos) com sazonalidade e ruído realistas.</w:t>
+        <w:t>Completude: verificar ausência de lacunas superiores a 1 mês nas séries temporais de atividade/emissão.</w:t>
       </w:r>
     </w:p>
     <w:p>
@@ -1492,7 +1874,7 @@
         <w:rPr>
           <w:rFonts w:ascii="Arial" w:hAnsi="Arial" w:cs="Arial"/>
         </w:rPr>
-        <w:t>Acesso: gerado localmente em Python; sem dependência externa.</w:t>
+        <w:t>Consistência de unidades: padronizar todas as unidades de consumo antes de aplicar os fatores de emissão.</w:t>
       </w:r>
     </w:p>
     <w:p>
@@ -1511,7 +1893,7 @@
         <w:rPr>
           <w:rFonts w:ascii="Arial" w:hAnsi="Arial" w:cs="Arial"/>
         </w:rPr>
-        <w:t>Uso planejado: variável de 'atividade' que, multiplicada pelo fator de emissão, gera a série de emissões usada para modelagem e dashboard.</w:t>
+        <w:t>Versionamento dos fatores de emissão: registrar o ano/versão do fator utilizado em cada cálculo, para rastreabilidade e auditoria.</w:t>
       </w:r>
     </w:p>
     <w:p>
@@ -1530,28 +1912,7 @@
         <w:rPr>
           <w:rFonts w:ascii="Arial" w:hAnsi="Arial" w:cs="Arial"/>
         </w:rPr>
-        <w:t>Riscos: por ser simulado, não captura toda a complexidade de dados reais; será documentado claramente como limitação do protótipo (MVP)</w:t>
-      </w:r>
-      <w:r>
-        <w:rPr>
-          <w:rFonts w:ascii="Arial" w:hAnsi="Arial" w:cs="Arial"/>
-        </w:rPr>
-        <w:t>.</w:t>
-      </w:r>
-    </w:p>
-    <w:p>
-      <w:pPr>
-        <w:pStyle w:val="Ttulo1"/>
-        <w:spacing w:before="300" w:after="150"/>
-        <w:rPr>
-          <w:rFonts w:ascii="Arial" w:hAnsi="Arial" w:cs="Arial"/>
-        </w:rPr>
-      </w:pPr>
-      <w:r>
-        <w:rPr>
-          <w:rFonts w:ascii="Arial" w:hAnsi="Arial" w:cs="Arial"/>
-        </w:rPr>
-        <w:t>4. Considerações Iniciais de Qualidade dos Dados</w:t>
+        <w:t>Conformidade de coleta (robots.txt): nenhuma fonte de scraping é acessada sem verificação prévia; fontes bloqueadas são automaticamente descartadas pelos scripts.</w:t>
       </w:r>
     </w:p>
     <w:p>
@@ -1570,7 +1931,7 @@
         <w:rPr>
           <w:rFonts w:ascii="Arial" w:hAnsi="Arial" w:cs="Arial"/>
         </w:rPr>
-        <w:t>Completude: verificar ausência de lacunas superiores a 1 mês nas séries temporais.</w:t>
+        <w:t>Direitos autorais: conteúdo textual coletado é armazenado em trechos curtos (ODS) ou apenas como metadados (notícias), nunca como reprodução integral de artigos.</w:t>
       </w:r>
     </w:p>
     <w:p>
@@ -1589,7 +1950,22 @@
         <w:rPr>
           <w:rFonts w:ascii="Arial" w:hAnsi="Arial" w:cs="Arial"/>
         </w:rPr>
-        <w:t>Consistência de unidades: padronizar todas as unidades de consumo (kWh, litros, km) antes de aplicar os fatores de emissão.</w:t>
+        <w:t>Validação de uploads: arquivos com schema incompatível são rejeitados antes de qualquer mesclagem ao dataset principal.</w:t>
+      </w:r>
+    </w:p>
+    <w:p>
+      <w:pPr>
+        <w:pStyle w:val="Ttulo1"/>
+        <w:spacing w:before="300" w:after="150"/>
+        <w:rPr>
+          <w:rFonts w:ascii="Arial" w:hAnsi="Arial" w:cs="Arial"/>
+        </w:rPr>
+      </w:pPr>
+      <w:r>
+        <w:rPr>
+          <w:rFonts w:ascii="Arial" w:hAnsi="Arial" w:cs="Arial"/>
+        </w:rPr>
+        <w:t>5. Próximos Passos</w:t>
       </w:r>
     </w:p>
     <w:p>
@@ -1608,7 +1984,7 @@
         <w:rPr>
           <w:rFonts w:ascii="Arial" w:hAnsi="Arial" w:cs="Arial"/>
         </w:rPr>
-        <w:t>Versionamento dos fatores de emissão: registrar o ano/versão do fator utilizado em cada cálculo, para rastreabilidade e auditoria.</w:t>
+        <w:t>Executar os scripts de scraping em ambiente com acesso à internet e atualizar Data/raw/ com uma coleta fresca.</w:t>
       </w:r>
     </w:p>
     <w:p>
@@ -1627,37 +2003,7 @@
         <w:rPr>
           <w:rFonts w:ascii="Arial" w:hAnsi="Arial" w:cs="Arial"/>
         </w:rPr>
-        <w:t xml:space="preserve">Consistência entre fontes: comparar fatores de emissão entre </w:t>
-      </w:r>
-      <w:proofErr w:type="spellStart"/>
-      <w:r>
-        <w:rPr>
-          <w:rFonts w:ascii="Arial" w:hAnsi="Arial" w:cs="Arial"/>
-        </w:rPr>
-        <w:t>Climatiq</w:t>
-      </w:r>
-      <w:proofErr w:type="spellEnd"/>
-      <w:r>
-        <w:rPr>
-          <w:rFonts w:ascii="Arial" w:hAnsi="Arial" w:cs="Arial"/>
-        </w:rPr>
-        <w:t xml:space="preserve"> e EPA/DEFRA para identificar divergências relevantes.</w:t>
-      </w:r>
-    </w:p>
-    <w:p>
-      <w:pPr>
-        <w:pStyle w:val="Ttulo1"/>
-        <w:spacing w:before="300" w:after="150"/>
-        <w:rPr>
-          <w:rFonts w:ascii="Arial" w:hAnsi="Arial" w:cs="Arial"/>
-        </w:rPr>
-      </w:pPr>
-      <w:r>
-        <w:rPr>
-          <w:rFonts w:ascii="Arial" w:hAnsi="Arial" w:cs="Arial"/>
-        </w:rPr>
-        <w:lastRenderedPageBreak/>
-        <w:t>5. Próximos Passos</w:t>
+        <w:t>Elaborar o Data Quality Report após a primeira análise exploratória (EDA) completa, incluindo as novas fontes textuais.</w:t>
       </w:r>
     </w:p>
     <w:p>
@@ -1676,35 +2022,7 @@
         <w:rPr>
           <w:rFonts w:ascii="Arial" w:hAnsi="Arial" w:cs="Arial"/>
         </w:rPr>
-        <w:t>Realizar chamadas de teste às APIs (</w:t>
-      </w:r>
-      <w:proofErr w:type="spellStart"/>
-      <w:r>
-        <w:rPr>
-          <w:rFonts w:ascii="Arial" w:hAnsi="Arial" w:cs="Arial"/>
-        </w:rPr>
-        <w:t>Climatiq</w:t>
-      </w:r>
-      <w:proofErr w:type="spellEnd"/>
-      <w:r>
-        <w:rPr>
-          <w:rFonts w:ascii="Arial" w:hAnsi="Arial" w:cs="Arial"/>
-        </w:rPr>
-        <w:t>, EPA/DEFRA) e documentar estrutura de resposta (</w:t>
-      </w:r>
-      <w:proofErr w:type="spellStart"/>
-      <w:r>
-        <w:rPr>
-          <w:rFonts w:ascii="Arial" w:hAnsi="Arial" w:cs="Arial"/>
-        </w:rPr>
-        <w:t>schema</w:t>
-      </w:r>
-      <w:proofErr w:type="spellEnd"/>
-      <w:r>
-        <w:rPr>
-          <w:rFonts w:ascii="Arial" w:hAnsi="Arial" w:cs="Arial"/>
-        </w:rPr>
-        <w:t>).</w:t>
+        <w:t>Avaliar a adição de mais fontes de notícias/portais para enriquecer a nuvem de palavras e reduzir viés de uma única fonte.</w:t>
       </w:r>
     </w:p>
     <w:p>
@@ -1723,59 +2041,7 @@
         <w:rPr>
           <w:rFonts w:ascii="Arial" w:hAnsi="Arial" w:cs="Arial"/>
         </w:rPr>
-        <w:t>Construir o gerador de dados simulados e validar sua plausibilidade estatística.</w:t>
-      </w:r>
-    </w:p>
-    <w:p>
-      <w:pPr>
-        <w:pStyle w:val="PargrafodaLista"/>
-        <w:numPr>
-          <w:ilvl w:val="0"/>
-          <w:numId w:val="1"/>
-        </w:numPr>
-        <w:spacing w:after="60"/>
-        <w:rPr>
-          <w:rFonts w:ascii="Arial" w:hAnsi="Arial" w:cs="Arial"/>
-        </w:rPr>
-      </w:pPr>
-      <w:r>
-        <w:rPr>
-          <w:rFonts w:ascii="Arial" w:hAnsi="Arial" w:cs="Arial"/>
-        </w:rPr>
-        <w:t xml:space="preserve">Elaborar o Data </w:t>
-      </w:r>
-      <w:proofErr w:type="spellStart"/>
-      <w:r>
-        <w:rPr>
-          <w:rFonts w:ascii="Arial" w:hAnsi="Arial" w:cs="Arial"/>
-        </w:rPr>
-        <w:t>Quality</w:t>
-      </w:r>
-      <w:proofErr w:type="spellEnd"/>
-      <w:r>
-        <w:rPr>
-          <w:rFonts w:ascii="Arial" w:hAnsi="Arial" w:cs="Arial"/>
-        </w:rPr>
-        <w:t xml:space="preserve"> Report após a primeira análise exploratória (EDA).</w:t>
-      </w:r>
-    </w:p>
-    <w:p>
-      <w:pPr>
-        <w:pStyle w:val="PargrafodaLista"/>
-        <w:numPr>
-          <w:ilvl w:val="0"/>
-          <w:numId w:val="1"/>
-        </w:numPr>
-        <w:spacing w:after="60"/>
-        <w:rPr>
-          <w:rFonts w:ascii="Arial" w:hAnsi="Arial" w:cs="Arial"/>
-        </w:rPr>
-      </w:pPr>
-      <w:r>
-        <w:rPr>
-          <w:rFonts w:ascii="Arial" w:hAnsi="Arial" w:cs="Arial"/>
-        </w:rPr>
-        <w:t>Atualizar este documento conforme novas fontes forem incorporadas ou descartadas.</w:t>
+        <w:t>Iniciar a fase de Modeling com o dataset consolidado (amostra + uploads).</w:t>
       </w:r>
     </w:p>
     <w:sectPr>
@@ -1791,10 +2057,10 @@
 <file path=word/numbering.xml><?xml version="1.0" encoding="utf-8"?>
 <w:numbering xmlns:wpc="http://schemas.microsoft.com/office/word/2010/wordprocessingCanvas" xmlns:cx="http://schemas.microsoft.com/office/drawing/2014/chartex" xmlns:cx1="http://schemas.microsoft.com/office/drawing/2015/9/8/chartex" xmlns:cx2="http://schemas.microsoft.com/office/drawing/2015/10/21/chartex" xmlns:cx3="http://schemas.microsoft.com/office/drawing/2016/5/9/chartex" xmlns:cx4="http://schemas.microsoft.com/office/drawing/2016/5/10/chartex" xmlns:cx5="http://schemas.microsoft.com/office/drawing/2016/5/11/chartex" xmlns:cx6="http://schemas.microsoft.com/office/drawing/2016/5/12/chartex" xmlns:cx7="http://schemas.microsoft.com/office/drawing/2016/5/13/chartex" xmlns:cx8="http://schemas.microsoft.com/office/drawing/2016/5/14/chartex" xmlns:mc="http://schemas.openxmlformats.org/markup-compatibility/2006" xmlns:aink="http://schemas.microsoft.com/office/drawing/2016/ink" xmlns:am3d="http://schemas.microsoft.com/office/drawing/2017/model3d" xmlns:o="urn:schemas-microsoft-com:office:office" xmlns:oel="http://schemas.microsoft.com/office/2019/extlst" xmlns:r="http://schemas.openxmlformats.org/officeDocument/2006/relationships" xmlns:m="http://schemas.openxmlformats.org/officeDocument/2006/math" xmlns:v="urn:schemas-microsoft-com:vml" xmlns:wp14="http://schemas.microsoft.com/office/word/2010/wordprocessingDrawing" xmlns:wp="http://schemas.openxmlformats.org/drawingml/2006/wordprocessingDrawing" xmlns:w10="urn:schemas-microsoft-com:office:word" xmlns:w="http://schemas.openxmlformats.org/wordprocessingml/2006/main" xmlns:w14="http://schemas.microsoft.com/office/word/2010/wordml" xmlns:w15="http://schemas.microsoft.com/office/word/2012/wordml" xmlns:w16cex="http://schemas.microsoft.com/office/word/2018/wordml/cex" xmlns:w16cid="http://schemas.microsoft.com/office/word/2016/wordml/cid" xmlns:w16="http://schemas.microsoft.com/office/word/2018/wordml" xmlns:w16du="http://schemas.microsoft.com/office/word/2023/wordml/word16du" xmlns:w16sdtdh="http://schemas.microsoft.com/office/word/2020/wordml/sdtdatahash" xmlns:w16sdtfl="http://schemas.microsoft.com/office/word/2024/wordml/sdtformatlock" xmlns:w16se="http://schemas.microsoft.com/office/word/2015/wordml/symex" xmlns:wpg="http://schemas.microsoft.com/office/word/2010/wordprocessingGroup" xmlns:wpi="http://schemas.microsoft.com/office/word/2010/wordprocessingInk" xmlns:wne="http://schemas.microsoft.com/office/word/2006/wordml" xmlns:wps="http://schemas.microsoft.com/office/word/2010/wordprocessingShape" mc:Ignorable="w14 w15 w16se w16cid w16 w16cex w16sdtdh w16sdtfl w16du wp14">
   <w:abstractNum w:abstractNumId="0" w15:restartNumberingAfterBreak="0">
-    <w:nsid w:val="56BE7140"/>
+    <w:nsid w:val="2466209A"/>
     <w:multiLevelType w:val="hybridMultilevel"/>
-    <w:tmpl w:val="04CEA41C"/>
-    <w:lvl w:ilvl="0" w:tplc="447C9A20">
+    <w:tmpl w:val="088C22F8"/>
+    <w:lvl w:ilvl="0" w:tplc="03CC0248">
       <w:start w:val="1"/>
       <w:numFmt w:val="bullet"/>
       <w:lvlText w:val="●"/>
@@ -1803,7 +2069,7 @@
         <w:ind w:left="720" w:hanging="360"/>
       </w:pPr>
     </w:lvl>
-    <w:lvl w:ilvl="1" w:tplc="51685714">
+    <w:lvl w:ilvl="1" w:tplc="D4E02CFC">
       <w:start w:val="1"/>
       <w:numFmt w:val="bullet"/>
       <w:lvlText w:val="○"/>
@@ -1812,7 +2078,7 @@
         <w:ind w:left="1440" w:hanging="360"/>
       </w:pPr>
     </w:lvl>
-    <w:lvl w:ilvl="2" w:tplc="1550016C">
+    <w:lvl w:ilvl="2" w:tplc="3C1663AA">
       <w:start w:val="1"/>
       <w:numFmt w:val="bullet"/>
       <w:lvlText w:val="■"/>
@@ -1821,7 +2087,7 @@
         <w:ind w:left="2160" w:hanging="360"/>
       </w:pPr>
     </w:lvl>
-    <w:lvl w:ilvl="3" w:tplc="008EB8EE">
+    <w:lvl w:ilvl="3" w:tplc="014AEB9C">
       <w:start w:val="1"/>
       <w:numFmt w:val="bullet"/>
       <w:lvlText w:val="●"/>
@@ -1830,7 +2096,7 @@
         <w:ind w:left="2880" w:hanging="360"/>
       </w:pPr>
     </w:lvl>
-    <w:lvl w:ilvl="4" w:tplc="1E7A6F5E">
+    <w:lvl w:ilvl="4" w:tplc="4B5ECAAA">
       <w:start w:val="1"/>
       <w:numFmt w:val="bullet"/>
       <w:lvlText w:val="○"/>
@@ -1839,7 +2105,7 @@
         <w:ind w:left="3600" w:hanging="360"/>
       </w:pPr>
     </w:lvl>
-    <w:lvl w:ilvl="5" w:tplc="CE8C6B06">
+    <w:lvl w:ilvl="5" w:tplc="798C8F8A">
       <w:start w:val="1"/>
       <w:numFmt w:val="bullet"/>
       <w:lvlText w:val="■"/>
@@ -1848,7 +2114,7 @@
         <w:ind w:left="4320" w:hanging="360"/>
       </w:pPr>
     </w:lvl>
-    <w:lvl w:ilvl="6" w:tplc="56486F90">
+    <w:lvl w:ilvl="6" w:tplc="46B28AAA">
       <w:start w:val="1"/>
       <w:numFmt w:val="bullet"/>
       <w:lvlText w:val="●"/>
@@ -1857,7 +2123,7 @@
         <w:ind w:left="5040" w:hanging="360"/>
       </w:pPr>
     </w:lvl>
-    <w:lvl w:ilvl="7" w:tplc="5F68882C">
+    <w:lvl w:ilvl="7" w:tplc="17B0FFAA">
       <w:start w:val="1"/>
       <w:numFmt w:val="bullet"/>
       <w:lvlText w:val="●"/>
@@ -1866,7 +2132,7 @@
         <w:ind w:left="5760" w:hanging="360"/>
       </w:pPr>
     </w:lvl>
-    <w:lvl w:ilvl="8" w:tplc="9D02C170">
+    <w:lvl w:ilvl="8" w:tplc="C310D4C2">
       <w:start w:val="1"/>
       <w:numFmt w:val="bullet"/>
       <w:lvlText w:val="●"/>
@@ -1876,7 +2142,7 @@
       </w:pPr>
     </w:lvl>
   </w:abstractNum>
-  <w:num w:numId="1" w16cid:durableId="1433671392">
+  <w:num w:numId="1" w16cid:durableId="1968587160">
     <w:abstractNumId w:val="0"/>
     <w:lvlOverride w:ilvl="0">
       <w:startOverride w:val="1"/>

</xml_diff>